<commit_message>
instruction about updatig tables
</commit_message>
<xml_diff>
--- a/docs/Инструкция по обновлению FAQ.docx
+++ b/docs/Инструкция по обновлению FAQ.docx
@@ -52,7 +52,7 @@
           <w:rFonts w:cs="Times New Roman"/>
           <w:sz w:val="28"/>
           <w:szCs w:val="28"/>
-          <w:lang w:val="en-GB"/>
+          <w:lang w:val="ru-RU"/>
         </w:rPr>
       </w:pPr>
       <w:r>
@@ -75,7 +75,7 @@
           <w:rFonts w:cs="Times New Roman"/>
           <w:sz w:val="28"/>
           <w:szCs w:val="28"/>
-          <w:lang w:val="en-GB"/>
+          <w:lang w:val="ru-RU"/>
         </w:rPr>
       </w:pPr>
       <w:r>
@@ -114,9 +114,50 @@
           <w:rFonts w:cs="Times New Roman"/>
           <w:sz w:val="28"/>
           <w:szCs w:val="28"/>
+          <w:lang w:val="ru-RU"/>
+        </w:rPr>
+      </w:pPr>
+      <w:r>
+        <w:rPr>
+          <w:rFonts w:cs="Times New Roman"/>
+          <w:bCs/>
+          <w:sz w:val="28"/>
+          <w:szCs w:val="28"/>
+          <w:lang w:val="ru-RU"/>
+        </w:rPr>
+        <w:t xml:space="preserve">1) замена файла с вопросами и ответами в файловом хранилище </w:t>
+      </w:r>
+      <w:proofErr w:type="spellStart"/>
+      <w:r>
+        <w:rPr>
+          <w:rFonts w:cs="Times New Roman"/>
+          <w:bCs/>
+          <w:sz w:val="28"/>
+          <w:szCs w:val="28"/>
+        </w:rPr>
+        <w:t>FileGator</w:t>
+      </w:r>
+      <w:proofErr w:type="spellEnd"/>
+      <w:r>
+        <w:rPr>
+          <w:rFonts w:cs="Times New Roman"/>
+          <w:bCs/>
+          <w:sz w:val="28"/>
+          <w:szCs w:val="28"/>
+          <w:lang w:val="ru-RU"/>
+        </w:rPr>
+        <w:t xml:space="preserve"> встроенном в </w:t>
+      </w:r>
+      <w:r>
+        <w:rPr>
+          <w:rFonts w:cs="Times New Roman"/>
+          <w:bCs/>
+          <w:sz w:val="28"/>
+          <w:szCs w:val="28"/>
           <w:lang w:val="en-GB"/>
         </w:rPr>
-      </w:pPr>
+        <w:t>kb</w:t>
+      </w:r>
       <w:r>
         <w:rPr>
           <w:rFonts w:cs="Times New Roman"/>
@@ -125,19 +166,38 @@
           <w:szCs w:val="28"/>
           <w:lang w:val="ru-RU"/>
         </w:rPr>
-        <w:t xml:space="preserve">1) замена файла с вопросами и ответами в файловом хранилище </w:t>
-      </w:r>
-      <w:proofErr w:type="spellStart"/>
+        <w:t>-</w:t>
+      </w:r>
       <w:r>
         <w:rPr>
           <w:rFonts w:cs="Times New Roman"/>
           <w:bCs/>
           <w:sz w:val="28"/>
           <w:szCs w:val="28"/>
-        </w:rPr>
-        <w:t>FileGator</w:t>
-      </w:r>
-      <w:proofErr w:type="spellEnd"/>
+          <w:lang w:val="en-GB"/>
+        </w:rPr>
+        <w:t>manager</w:t>
+      </w:r>
+      <w:r>
+        <w:rPr>
+          <w:rFonts w:cs="Times New Roman"/>
+          <w:bCs/>
+          <w:sz w:val="28"/>
+          <w:szCs w:val="28"/>
+          <w:lang w:val="ru-RU"/>
+        </w:rPr>
+        <w:t xml:space="preserve"> </w:t>
+      </w:r>
+      <w:r>
+        <w:rPr>
+          <w:rFonts w:cs="Times New Roman"/>
+          <w:bCs/>
+          <w:sz w:val="28"/>
+          <w:szCs w:val="28"/>
+          <w:lang w:val="en-GB"/>
+        </w:rPr>
+        <w:t>UI</w:t>
+      </w:r>
       <w:r>
         <w:rPr>
           <w:rFonts w:cs="Times New Roman"/>
@@ -444,6 +504,7 @@
                 <w:rFonts w:cs="Times New Roman"/>
                 <w:sz w:val="28"/>
                 <w:szCs w:val="28"/>
+                <w:lang w:val="ru-RU"/>
               </w:rPr>
             </w:pPr>
             <w:r>
@@ -452,7 +513,140 @@
                 <w:sz w:val="28"/>
                 <w:szCs w:val="28"/>
               </w:rPr>
-              <w:t>https://kb-file-ui-chatbot-prod.nstcloud.ru</w:t>
+              <w:t>https</w:t>
+            </w:r>
+            <w:r>
+              <w:rPr>
+                <w:rFonts w:cs="Times New Roman"/>
+                <w:sz w:val="28"/>
+                <w:szCs w:val="28"/>
+                <w:lang w:val="ru-RU"/>
+              </w:rPr>
+              <w:t>://</w:t>
+            </w:r>
+            <w:r>
+              <w:rPr>
+                <w:rFonts w:cs="Times New Roman"/>
+                <w:sz w:val="28"/>
+                <w:szCs w:val="28"/>
+              </w:rPr>
+              <w:t>kb</w:t>
+            </w:r>
+            <w:r>
+              <w:rPr>
+                <w:rFonts w:cs="Times New Roman"/>
+                <w:sz w:val="28"/>
+                <w:szCs w:val="28"/>
+                <w:lang w:val="ru-RU"/>
+              </w:rPr>
+              <w:t>-</w:t>
+            </w:r>
+            <w:r>
+              <w:rPr>
+                <w:rFonts w:cs="Times New Roman"/>
+                <w:sz w:val="28"/>
+                <w:szCs w:val="28"/>
+              </w:rPr>
+              <w:t>manager</w:t>
+            </w:r>
+            <w:r>
+              <w:rPr>
+                <w:rFonts w:cs="Times New Roman"/>
+                <w:sz w:val="28"/>
+                <w:szCs w:val="28"/>
+                <w:lang w:val="ru-RU"/>
+              </w:rPr>
+              <w:t>-</w:t>
+            </w:r>
+            <w:r>
+              <w:rPr>
+                <w:rFonts w:cs="Times New Roman"/>
+                <w:sz w:val="28"/>
+                <w:szCs w:val="28"/>
+              </w:rPr>
+              <w:t>chatbot</w:t>
+            </w:r>
+            <w:r>
+              <w:rPr>
+                <w:rFonts w:cs="Times New Roman"/>
+                <w:sz w:val="28"/>
+                <w:szCs w:val="28"/>
+                <w:lang w:val="ru-RU"/>
+              </w:rPr>
+              <w:t>-</w:t>
+            </w:r>
+            <w:r>
+              <w:rPr>
+                <w:rFonts w:cs="Times New Roman"/>
+                <w:sz w:val="28"/>
+                <w:szCs w:val="28"/>
+              </w:rPr>
+              <w:t>prod</w:t>
+            </w:r>
+            <w:r>
+              <w:rPr>
+                <w:rFonts w:cs="Times New Roman"/>
+                <w:sz w:val="28"/>
+                <w:szCs w:val="28"/>
+                <w:lang w:val="ru-RU"/>
+              </w:rPr>
+              <w:t>.</w:t>
+            </w:r>
+            <w:proofErr w:type="spellStart"/>
+            <w:r>
+              <w:rPr>
+                <w:rFonts w:cs="Times New Roman"/>
+                <w:sz w:val="28"/>
+                <w:szCs w:val="28"/>
+              </w:rPr>
+              <w:t>nstcloud</w:t>
+            </w:r>
+            <w:proofErr w:type="spellEnd"/>
+            <w:r>
+              <w:rPr>
+                <w:rFonts w:cs="Times New Roman"/>
+                <w:sz w:val="28"/>
+                <w:szCs w:val="28"/>
+                <w:lang w:val="ru-RU"/>
+              </w:rPr>
+              <w:t>.</w:t>
+            </w:r>
+            <w:proofErr w:type="spellStart"/>
+            <w:r>
+              <w:rPr>
+                <w:rFonts w:cs="Times New Roman"/>
+                <w:sz w:val="28"/>
+                <w:szCs w:val="28"/>
+              </w:rPr>
+              <w:t>ru</w:t>
+            </w:r>
+            <w:proofErr w:type="spellEnd"/>
+            <w:r>
+              <w:rPr>
+                <w:rFonts w:cs="Times New Roman"/>
+                <w:sz w:val="28"/>
+                <w:szCs w:val="28"/>
+                <w:lang w:val="ru-RU"/>
+              </w:rPr>
+              <w:t>/</w:t>
+            </w:r>
+            <w:r>
+              <w:rPr>
+                <w:rFonts w:cs="Times New Roman"/>
+                <w:sz w:val="28"/>
+                <w:szCs w:val="28"/>
+                <w:lang w:val="ru-RU"/>
+              </w:rPr>
+              <w:t xml:space="preserve"> </w:t>
+            </w:r>
+            <w:r>
+              <w:rPr>
+                <w:rFonts w:cs="Times New Roman"/>
+                <w:sz w:val="28"/>
+                <w:szCs w:val="28"/>
+                <w:lang w:val="ru-RU"/>
+              </w:rPr>
+              <w:t>вкладка файловый менеджер.</w:t>
             </w:r>
           </w:p>
         </w:tc>
@@ -699,7 +893,43 @@
           <w:szCs w:val="28"/>
           <w:lang w:val="ru-RU"/>
         </w:rPr>
-        <w:t xml:space="preserve">2.1 Откройте веб-браузер и перейдите в файловое хранилище по адресу: </w:t>
+        <w:t>2.1 Откройте</w:t>
+      </w:r>
+      <w:r>
+        <w:rPr>
+          <w:rFonts w:cs="Times New Roman"/>
+          <w:sz w:val="28"/>
+          <w:szCs w:val="28"/>
+          <w:lang w:val="ru-RU"/>
+        </w:rPr>
+        <w:t xml:space="preserve"> в</w:t>
+      </w:r>
+      <w:r>
+        <w:rPr>
+          <w:rFonts w:cs="Times New Roman"/>
+          <w:sz w:val="28"/>
+          <w:szCs w:val="28"/>
+          <w:lang w:val="ru-RU"/>
+        </w:rPr>
+        <w:t xml:space="preserve"> веб-браузер</w:t>
+      </w:r>
+      <w:r>
+        <w:rPr>
+          <w:rFonts w:cs="Times New Roman"/>
+          <w:sz w:val="28"/>
+          <w:szCs w:val="28"/>
+          <w:lang w:val="ru-RU"/>
+        </w:rPr>
+        <w:t>е сервис</w:t>
+      </w:r>
+      <w:r>
+        <w:rPr>
+          <w:rFonts w:cs="Times New Roman"/>
+          <w:sz w:val="28"/>
+          <w:szCs w:val="28"/>
+          <w:lang w:val="ru-RU"/>
+        </w:rPr>
+        <w:t xml:space="preserve"> </w:t>
       </w:r>
       <w:r>
         <w:rPr>
@@ -708,6 +938,63 @@
           <w:sz w:val="28"/>
           <w:szCs w:val="28"/>
         </w:rPr>
+        <w:t>KB</w:t>
+      </w:r>
+      <w:r>
+        <w:rPr>
+          <w:rFonts w:cs="Times New Roman"/>
+          <w:b/>
+          <w:sz w:val="28"/>
+          <w:szCs w:val="28"/>
+          <w:lang w:val="ru-RU"/>
+        </w:rPr>
+        <w:t xml:space="preserve"> </w:t>
+      </w:r>
+      <w:r>
+        <w:rPr>
+          <w:rFonts w:cs="Times New Roman"/>
+          <w:b/>
+          <w:sz w:val="28"/>
+          <w:szCs w:val="28"/>
+        </w:rPr>
+        <w:t>Manager</w:t>
+      </w:r>
+      <w:r>
+        <w:rPr>
+          <w:rFonts w:cs="Times New Roman"/>
+          <w:b/>
+          <w:sz w:val="28"/>
+          <w:szCs w:val="28"/>
+          <w:lang w:val="ru-RU"/>
+        </w:rPr>
+        <w:t xml:space="preserve"> </w:t>
+      </w:r>
+      <w:r>
+        <w:rPr>
+          <w:rFonts w:cs="Times New Roman"/>
+          <w:bCs/>
+          <w:sz w:val="28"/>
+          <w:szCs w:val="28"/>
+          <w:lang w:val="ru-RU"/>
+        </w:rPr>
+        <w:t>по адресу:</w:t>
+      </w:r>
+      <w:r>
+        <w:rPr>
+          <w:rFonts w:cs="Times New Roman"/>
+          <w:sz w:val="28"/>
+          <w:szCs w:val="28"/>
+          <w:lang w:val="ru-RU"/>
+        </w:rPr>
+        <w:t xml:space="preserve"> </w:t>
+      </w:r>
+      <w:r>
+        <w:rPr>
+          <w:rFonts w:cs="Times New Roman"/>
+          <w:b/>
+          <w:sz w:val="28"/>
+          <w:szCs w:val="28"/>
+        </w:rPr>
         <w:t>https</w:t>
       </w:r>
       <w:r>
@@ -746,7 +1033,7 @@
           <w:sz w:val="28"/>
           <w:szCs w:val="28"/>
         </w:rPr>
-        <w:t>file</w:t>
+        <w:t>manager</w:t>
       </w:r>
       <w:r>
         <w:rPr>
@@ -758,6 +1045,44 @@
         </w:rPr>
         <w:t>-</w:t>
       </w:r>
+      <w:r>
+        <w:rPr>
+          <w:rFonts w:cs="Times New Roman"/>
+          <w:b/>
+          <w:sz w:val="28"/>
+          <w:szCs w:val="28"/>
+        </w:rPr>
+        <w:t>chatbot</w:t>
+      </w:r>
+      <w:r>
+        <w:rPr>
+          <w:rFonts w:cs="Times New Roman"/>
+          <w:b/>
+          <w:sz w:val="28"/>
+          <w:szCs w:val="28"/>
+          <w:lang w:val="ru-RU"/>
+        </w:rPr>
+        <w:t>-</w:t>
+      </w:r>
+      <w:r>
+        <w:rPr>
+          <w:rFonts w:cs="Times New Roman"/>
+          <w:b/>
+          <w:sz w:val="28"/>
+          <w:szCs w:val="28"/>
+        </w:rPr>
+        <w:t>prod</w:t>
+      </w:r>
+      <w:r>
+        <w:rPr>
+          <w:rFonts w:cs="Times New Roman"/>
+          <w:b/>
+          <w:sz w:val="28"/>
+          <w:szCs w:val="28"/>
+          <w:lang w:val="ru-RU"/>
+        </w:rPr>
+        <w:t>.</w:t>
+      </w:r>
       <w:proofErr w:type="spellStart"/>
       <w:r>
         <w:rPr>
@@ -766,7 +1091,7 @@
           <w:sz w:val="28"/>
           <w:szCs w:val="28"/>
         </w:rPr>
-        <w:t>ui</w:t>
+        <w:t>nstcloud</w:t>
       </w:r>
       <w:proofErr w:type="spellEnd"/>
       <w:r>
@@ -777,8 +1102,9 @@
           <w:szCs w:val="28"/>
           <w:lang w:val="ru-RU"/>
         </w:rPr>
-        <w:t>-</w:t>
-      </w:r>
+        <w:t>.</w:t>
+      </w:r>
+      <w:proofErr w:type="spellStart"/>
       <w:r>
         <w:rPr>
           <w:rFonts w:cs="Times New Roman"/>
@@ -786,8 +1112,9 @@
           <w:sz w:val="28"/>
           <w:szCs w:val="28"/>
         </w:rPr>
-        <w:t>chatbot</w:t>
-      </w:r>
+        <w:t>ru</w:t>
+      </w:r>
+      <w:proofErr w:type="spellEnd"/>
       <w:r>
         <w:rPr>
           <w:rFonts w:cs="Times New Roman"/>
@@ -796,7 +1123,34 @@
           <w:szCs w:val="28"/>
           <w:lang w:val="ru-RU"/>
         </w:rPr>
-        <w:t>-</w:t>
+        <w:t>/</w:t>
+      </w:r>
+      <w:r>
+        <w:rPr>
+          <w:rFonts w:cs="Times New Roman"/>
+          <w:sz w:val="28"/>
+          <w:szCs w:val="28"/>
+          <w:lang w:val="ru-RU"/>
+        </w:rPr>
+        <w:t xml:space="preserve"> В появившейся форме авторизации (рисунок </w:t>
+      </w:r>
+      <w:r>
+        <w:rPr>
+          <w:rFonts w:cs="Times New Roman"/>
+          <w:sz w:val="28"/>
+          <w:szCs w:val="28"/>
+          <w:lang w:val="ru-RU"/>
+        </w:rPr>
+        <w:t>1</w:t>
+      </w:r>
+      <w:r>
+        <w:rPr>
+          <w:rFonts w:cs="Times New Roman"/>
+          <w:sz w:val="28"/>
+          <w:szCs w:val="28"/>
+          <w:lang w:val="ru-RU"/>
+        </w:rPr>
+        <w:t xml:space="preserve">) введите свое имя пользователя и пароль, после чего нажмите </w:t>
       </w:r>
       <w:r>
         <w:rPr>
@@ -804,168 +1158,9 @@
           <w:b/>
           <w:sz w:val="28"/>
           <w:szCs w:val="28"/>
-        </w:rPr>
-        <w:t>prod</w:t>
-      </w:r>
-      <w:r>
-        <w:rPr>
-          <w:rFonts w:cs="Times New Roman"/>
-          <w:b/>
-          <w:sz w:val="28"/>
-          <w:szCs w:val="28"/>
-          <w:lang w:val="ru-RU"/>
-        </w:rPr>
-        <w:t>.</w:t>
-      </w:r>
-      <w:proofErr w:type="spellStart"/>
-      <w:r>
-        <w:rPr>
-          <w:rFonts w:cs="Times New Roman"/>
-          <w:b/>
-          <w:sz w:val="28"/>
-          <w:szCs w:val="28"/>
-        </w:rPr>
-        <w:t>nstcloud</w:t>
-      </w:r>
-      <w:proofErr w:type="spellEnd"/>
-      <w:r>
-        <w:rPr>
-          <w:rFonts w:cs="Times New Roman"/>
-          <w:b/>
-          <w:sz w:val="28"/>
-          <w:szCs w:val="28"/>
-          <w:lang w:val="ru-RU"/>
-        </w:rPr>
-        <w:t>.</w:t>
-      </w:r>
-      <w:proofErr w:type="spellStart"/>
-      <w:r>
-        <w:rPr>
-          <w:rFonts w:cs="Times New Roman"/>
-          <w:b/>
-          <w:sz w:val="28"/>
-          <w:szCs w:val="28"/>
-        </w:rPr>
-        <w:t>ru</w:t>
-      </w:r>
-      <w:proofErr w:type="spellEnd"/>
-      <w:r>
-        <w:rPr>
-          <w:rFonts w:cs="Times New Roman"/>
-          <w:sz w:val="28"/>
-          <w:szCs w:val="28"/>
-          <w:lang w:val="ru-RU"/>
-        </w:rPr>
-        <w:t>. Выполните вход, указав предоставленные логин и пароль.</w:t>
-      </w:r>
-    </w:p>
-    <w:p>
-      <w:pPr>
-        <w:spacing w:after="0" w:line="360" w:lineRule="auto"/>
-        <w:ind w:firstLine="709"/>
-        <w:jc w:val="both"/>
-        <w:rPr>
-          <w:rFonts w:cs="Times New Roman"/>
-          <w:sz w:val="28"/>
-          <w:szCs w:val="28"/>
-          <w:lang w:val="ru-RU"/>
-        </w:rPr>
-      </w:pPr>
-      <w:r>
-        <w:rPr>
-          <w:rFonts w:cs="Times New Roman"/>
-          <w:sz w:val="28"/>
-          <w:szCs w:val="28"/>
-          <w:lang w:val="ru-RU"/>
-        </w:rPr>
-        <w:t xml:space="preserve">2.2 В корневом каталоге файлового менеджера перейдите в папку </w:t>
-      </w:r>
-      <w:proofErr w:type="spellStart"/>
-      <w:r>
-        <w:rPr>
-          <w:rFonts w:cs="Times New Roman"/>
-          <w:b/>
-          <w:sz w:val="28"/>
-          <w:szCs w:val="28"/>
-        </w:rPr>
-        <w:t>faq</w:t>
-      </w:r>
-      <w:proofErr w:type="spellEnd"/>
-      <w:r>
-        <w:rPr>
-          <w:rFonts w:cs="Times New Roman"/>
-          <w:sz w:val="28"/>
-          <w:szCs w:val="28"/>
-          <w:lang w:val="ru-RU"/>
-        </w:rPr>
-        <w:t xml:space="preserve"> (рисунок 1), а внутри нее откройте папку </w:t>
-      </w:r>
-      <w:r>
-        <w:rPr>
-          <w:rFonts w:cs="Times New Roman"/>
-          <w:b/>
-          <w:sz w:val="28"/>
-          <w:szCs w:val="28"/>
-        </w:rPr>
-        <w:t>default</w:t>
-      </w:r>
-      <w:r>
-        <w:rPr>
-          <w:rFonts w:cs="Times New Roman"/>
-          <w:sz w:val="28"/>
-          <w:szCs w:val="28"/>
-          <w:lang w:val="ru-RU"/>
-        </w:rPr>
-        <w:t xml:space="preserve">. Рабочий путь в системе должен выглядеть следующим образом: </w:t>
-      </w:r>
-      <w:r>
-        <w:rPr>
-          <w:rFonts w:cs="Times New Roman"/>
-          <w:b/>
-          <w:sz w:val="28"/>
-          <w:szCs w:val="28"/>
-        </w:rPr>
-        <w:t>Home</w:t>
-      </w:r>
-      <w:r>
-        <w:rPr>
-          <w:rFonts w:cs="Times New Roman"/>
-          <w:b/>
-          <w:sz w:val="28"/>
-          <w:szCs w:val="28"/>
-          <w:lang w:val="ru-RU"/>
-        </w:rPr>
-        <w:t xml:space="preserve"> / </w:t>
-      </w:r>
-      <w:proofErr w:type="spellStart"/>
-      <w:r>
-        <w:rPr>
-          <w:rFonts w:cs="Times New Roman"/>
-          <w:b/>
-          <w:sz w:val="28"/>
-          <w:szCs w:val="28"/>
-        </w:rPr>
-        <w:t>faq</w:t>
-      </w:r>
-      <w:proofErr w:type="spellEnd"/>
-      <w:r>
-        <w:rPr>
-          <w:rFonts w:cs="Times New Roman"/>
-          <w:b/>
-          <w:sz w:val="28"/>
-          <w:szCs w:val="28"/>
-          <w:lang w:val="ru-RU"/>
-        </w:rPr>
-        <w:t xml:space="preserve"> / </w:t>
-      </w:r>
-      <w:r>
-        <w:rPr>
-          <w:rFonts w:cs="Times New Roman"/>
-          <w:b/>
-          <w:sz w:val="28"/>
-          <w:szCs w:val="28"/>
-        </w:rPr>
-        <w:t>default</w:t>
+          <w:lang w:val="ru-RU"/>
+        </w:rPr>
+        <w:t>«Войти»</w:t>
       </w:r>
       <w:r>
         <w:rPr>
@@ -997,1005 +1192,10 @@
         </w:rPr>
         <w:lastRenderedPageBreak/>
         <w:drawing>
-          <wp:inline distT="0" distB="0" distL="0" distR="0" wp14:anchorId="4CB5FFEA" wp14:editId="7D278095">
-            <wp:extent cx="5580000" cy="2597217"/>
-            <wp:effectExtent l="0" t="0" r="0" b="0"/>
-            <wp:docPr id="1" name="Picture 1"/>
-            <wp:cNvGraphicFramePr>
-              <a:graphicFrameLocks xmlns:a="http://schemas.openxmlformats.org/drawingml/2006/main" noChangeAspect="1"/>
-            </wp:cNvGraphicFramePr>
-            <a:graphic xmlns:a="http://schemas.openxmlformats.org/drawingml/2006/main">
-              <a:graphicData uri="http://schemas.openxmlformats.org/drawingml/2006/picture">
-                <pic:pic xmlns:pic="http://schemas.openxmlformats.org/drawingml/2006/picture">
-                  <pic:nvPicPr>
-                    <pic:cNvPr id="0" name="input_file_1.png"/>
-                    <pic:cNvPicPr/>
-                  </pic:nvPicPr>
-                  <pic:blipFill>
-                    <a:blip r:embed="rId8"/>
-                    <a:stretch>
-                      <a:fillRect/>
-                    </a:stretch>
-                  </pic:blipFill>
-                  <pic:spPr>
-                    <a:xfrm>
-                      <a:off x="0" y="0"/>
-                      <a:ext cx="5580000" cy="2597217"/>
-                    </a:xfrm>
-                    <a:prstGeom prst="rect">
-                      <a:avLst/>
-                    </a:prstGeom>
-                  </pic:spPr>
-                </pic:pic>
-              </a:graphicData>
-            </a:graphic>
-          </wp:inline>
-        </w:drawing>
-      </w:r>
-    </w:p>
-    <w:p>
-      <w:pPr>
-        <w:spacing w:after="0" w:line="360" w:lineRule="auto"/>
-        <w:jc w:val="center"/>
-        <w:rPr>
-          <w:rFonts w:cs="Times New Roman"/>
-          <w:sz w:val="28"/>
-          <w:szCs w:val="28"/>
-          <w:lang w:val="ru-RU"/>
-        </w:rPr>
-      </w:pPr>
-      <w:r>
-        <w:rPr>
-          <w:rFonts w:cs="Times New Roman"/>
-          <w:sz w:val="28"/>
-          <w:szCs w:val="28"/>
-          <w:lang w:val="ru-RU"/>
-        </w:rPr>
-        <w:t xml:space="preserve">Рисунок 1 – Выбор каталога </w:t>
-      </w:r>
-      <w:proofErr w:type="spellStart"/>
-      <w:r>
-        <w:rPr>
-          <w:rFonts w:cs="Times New Roman"/>
-          <w:sz w:val="28"/>
-          <w:szCs w:val="28"/>
-        </w:rPr>
-        <w:t>faq</w:t>
-      </w:r>
-      <w:proofErr w:type="spellEnd"/>
-      <w:r>
-        <w:rPr>
-          <w:rFonts w:cs="Times New Roman"/>
-          <w:sz w:val="28"/>
-          <w:szCs w:val="28"/>
-          <w:lang w:val="ru-RU"/>
-        </w:rPr>
-        <w:t xml:space="preserve"> в хранилище </w:t>
-      </w:r>
-      <w:proofErr w:type="spellStart"/>
-      <w:r>
-        <w:rPr>
-          <w:rFonts w:cs="Times New Roman"/>
-          <w:sz w:val="28"/>
-          <w:szCs w:val="28"/>
-        </w:rPr>
-        <w:t>FileGator</w:t>
-      </w:r>
-      <w:proofErr w:type="spellEnd"/>
-    </w:p>
-    <w:p>
-      <w:pPr>
-        <w:spacing w:after="0" w:line="360" w:lineRule="auto"/>
-        <w:ind w:firstLine="709"/>
-        <w:jc w:val="both"/>
-        <w:rPr>
-          <w:rFonts w:cs="Times New Roman"/>
-          <w:sz w:val="28"/>
-          <w:szCs w:val="28"/>
-          <w:lang w:val="ru-RU"/>
-        </w:rPr>
-      </w:pPr>
-      <w:r>
-        <w:rPr>
-          <w:rFonts w:cs="Times New Roman"/>
-          <w:sz w:val="28"/>
-          <w:szCs w:val="28"/>
-          <w:lang w:val="ru-RU"/>
-        </w:rPr>
-        <w:t xml:space="preserve">2.3 Перед загрузкой новой редакции вопросов обязательно удалите старые файлы. Нажмите на </w:t>
-      </w:r>
-      <w:r>
-        <w:rPr>
-          <w:rFonts w:cs="Times New Roman"/>
-          <w:b/>
-          <w:sz w:val="28"/>
-          <w:szCs w:val="28"/>
-          <w:lang w:val="ru-RU"/>
-        </w:rPr>
-        <w:t>чекбокс в левом верхнем углу таблицы</w:t>
-      </w:r>
-      <w:r>
-        <w:rPr>
-          <w:rFonts w:cs="Times New Roman"/>
-          <w:sz w:val="28"/>
-          <w:szCs w:val="28"/>
-          <w:lang w:val="ru-RU"/>
-        </w:rPr>
-        <w:t xml:space="preserve"> рядом с колонкой «</w:t>
-      </w:r>
-      <w:r>
-        <w:rPr>
-          <w:rFonts w:cs="Times New Roman"/>
-          <w:sz w:val="28"/>
-          <w:szCs w:val="28"/>
-        </w:rPr>
-        <w:t>Name</w:t>
-      </w:r>
-      <w:r>
-        <w:rPr>
-          <w:rFonts w:cs="Times New Roman"/>
-          <w:sz w:val="28"/>
-          <w:szCs w:val="28"/>
-          <w:lang w:val="ru-RU"/>
-        </w:rPr>
-        <w:t>» (рисунок 2), чтобы выделить все находящиеся в каталоге файлы и папки.</w:t>
-      </w:r>
-    </w:p>
-    <w:p>
-      <w:pPr>
-        <w:keepNext/>
-        <w:spacing w:before="120" w:after="60"/>
-        <w:jc w:val="center"/>
-        <w:rPr>
-          <w:rFonts w:cs="Times New Roman"/>
-          <w:sz w:val="28"/>
-          <w:szCs w:val="28"/>
-        </w:rPr>
-      </w:pPr>
-      <w:r>
-        <w:rPr>
-          <w:rFonts w:cs="Times New Roman"/>
-          <w:noProof/>
-          <w:sz w:val="28"/>
-          <w:szCs w:val="28"/>
-        </w:rPr>
-        <w:drawing>
-          <wp:inline distT="0" distB="0" distL="0" distR="0" wp14:anchorId="6F7CC664" wp14:editId="20D3EAAF">
-            <wp:extent cx="5580000" cy="2316033"/>
-            <wp:effectExtent l="0" t="0" r="0" b="0"/>
-            <wp:docPr id="2" name="Picture 2"/>
-            <wp:cNvGraphicFramePr>
-              <a:graphicFrameLocks xmlns:a="http://schemas.openxmlformats.org/drawingml/2006/main" noChangeAspect="1"/>
-            </wp:cNvGraphicFramePr>
-            <a:graphic xmlns:a="http://schemas.openxmlformats.org/drawingml/2006/main">
-              <a:graphicData uri="http://schemas.openxmlformats.org/drawingml/2006/picture">
-                <pic:pic xmlns:pic="http://schemas.openxmlformats.org/drawingml/2006/picture">
-                  <pic:nvPicPr>
-                    <pic:cNvPr id="0" name="input_file_2.png"/>
-                    <pic:cNvPicPr/>
-                  </pic:nvPicPr>
-                  <pic:blipFill>
-                    <a:blip r:embed="rId9"/>
-                    <a:stretch>
-                      <a:fillRect/>
-                    </a:stretch>
-                  </pic:blipFill>
-                  <pic:spPr>
-                    <a:xfrm>
-                      <a:off x="0" y="0"/>
-                      <a:ext cx="5580000" cy="2316033"/>
-                    </a:xfrm>
-                    <a:prstGeom prst="rect">
-                      <a:avLst/>
-                    </a:prstGeom>
-                  </pic:spPr>
-                </pic:pic>
-              </a:graphicData>
-            </a:graphic>
-          </wp:inline>
-        </w:drawing>
-      </w:r>
-    </w:p>
-    <w:p>
-      <w:pPr>
-        <w:spacing w:after="0" w:line="360" w:lineRule="auto"/>
-        <w:jc w:val="center"/>
-        <w:rPr>
-          <w:rFonts w:cs="Times New Roman"/>
-          <w:sz w:val="28"/>
-          <w:szCs w:val="28"/>
-          <w:lang w:val="ru-RU"/>
-        </w:rPr>
-      </w:pPr>
-      <w:r>
-        <w:rPr>
-          <w:rFonts w:cs="Times New Roman"/>
-          <w:sz w:val="28"/>
-          <w:szCs w:val="28"/>
-          <w:lang w:val="ru-RU"/>
-        </w:rPr>
-        <w:t>Рисунок 2 – Кнопка группового выделения содержимого папки</w:t>
-      </w:r>
-    </w:p>
-    <w:p>
-      <w:pPr>
-        <w:spacing w:after="0" w:line="360" w:lineRule="auto"/>
-        <w:ind w:firstLine="709"/>
-        <w:jc w:val="both"/>
-        <w:rPr>
-          <w:rFonts w:cs="Times New Roman"/>
-          <w:sz w:val="28"/>
-          <w:szCs w:val="28"/>
-          <w:lang w:val="ru-RU"/>
-        </w:rPr>
-      </w:pPr>
-      <w:r>
-        <w:rPr>
-          <w:rFonts w:cs="Times New Roman"/>
-          <w:sz w:val="28"/>
-          <w:szCs w:val="28"/>
-          <w:lang w:val="ru-RU"/>
-        </w:rPr>
-        <w:t xml:space="preserve">2.4 После </w:t>
-      </w:r>
-      <w:r>
-        <w:rPr>
-          <w:rFonts w:cs="Times New Roman"/>
-          <w:sz w:val="28"/>
-          <w:szCs w:val="28"/>
-          <w:lang w:val="ru-RU"/>
-        </w:rPr>
-        <w:t>того,</w:t>
-      </w:r>
-      <w:r>
-        <w:rPr>
-          <w:rFonts w:cs="Times New Roman"/>
-          <w:sz w:val="28"/>
-          <w:szCs w:val="28"/>
-          <w:lang w:val="ru-RU"/>
-        </w:rPr>
-        <w:t xml:space="preserve"> как файлы выделились (отметились зелеными маркерами), нажмите кнопку </w:t>
-      </w:r>
-      <w:r>
-        <w:rPr>
-          <w:rFonts w:cs="Times New Roman"/>
-          <w:b/>
-          <w:sz w:val="28"/>
-          <w:szCs w:val="28"/>
-          <w:lang w:val="ru-RU"/>
-        </w:rPr>
-        <w:t>«</w:t>
-      </w:r>
-      <w:r>
-        <w:rPr>
-          <w:rFonts w:cs="Times New Roman"/>
-          <w:b/>
-          <w:sz w:val="28"/>
-          <w:szCs w:val="28"/>
-        </w:rPr>
-        <w:t>Delete</w:t>
-      </w:r>
-      <w:r>
-        <w:rPr>
-          <w:rFonts w:cs="Times New Roman"/>
-          <w:b/>
-          <w:sz w:val="28"/>
-          <w:szCs w:val="28"/>
-          <w:lang w:val="ru-RU"/>
-        </w:rPr>
-        <w:t>»</w:t>
-      </w:r>
-      <w:r>
-        <w:rPr>
-          <w:rFonts w:cs="Times New Roman"/>
-          <w:sz w:val="28"/>
-          <w:szCs w:val="28"/>
-          <w:lang w:val="ru-RU"/>
-        </w:rPr>
-        <w:t xml:space="preserve"> на верхней панели действий (рисунок 3) и подтвердите удаление.</w:t>
-      </w:r>
-    </w:p>
-    <w:p>
-      <w:pPr>
-        <w:keepNext/>
-        <w:spacing w:before="120" w:after="60"/>
-        <w:jc w:val="center"/>
-        <w:rPr>
-          <w:rFonts w:cs="Times New Roman"/>
-          <w:sz w:val="28"/>
-          <w:szCs w:val="28"/>
-        </w:rPr>
-      </w:pPr>
-      <w:r>
-        <w:rPr>
-          <w:rFonts w:cs="Times New Roman"/>
-          <w:noProof/>
-          <w:sz w:val="28"/>
-          <w:szCs w:val="28"/>
-        </w:rPr>
-        <w:lastRenderedPageBreak/>
-        <w:drawing>
-          <wp:inline distT="0" distB="0" distL="0" distR="0" wp14:anchorId="7CDEF4E4" wp14:editId="1065CD4F">
-            <wp:extent cx="5580000" cy="2442607"/>
-            <wp:effectExtent l="0" t="0" r="0" b="0"/>
-            <wp:docPr id="3" name="Picture 3"/>
-            <wp:cNvGraphicFramePr>
-              <a:graphicFrameLocks xmlns:a="http://schemas.openxmlformats.org/drawingml/2006/main" noChangeAspect="1"/>
-            </wp:cNvGraphicFramePr>
-            <a:graphic xmlns:a="http://schemas.openxmlformats.org/drawingml/2006/main">
-              <a:graphicData uri="http://schemas.openxmlformats.org/drawingml/2006/picture">
-                <pic:pic xmlns:pic="http://schemas.openxmlformats.org/drawingml/2006/picture">
-                  <pic:nvPicPr>
-                    <pic:cNvPr id="0" name="input_file_3.png"/>
-                    <pic:cNvPicPr/>
-                  </pic:nvPicPr>
-                  <pic:blipFill>
-                    <a:blip r:embed="rId10"/>
-                    <a:stretch>
-                      <a:fillRect/>
-                    </a:stretch>
-                  </pic:blipFill>
-                  <pic:spPr>
-                    <a:xfrm>
-                      <a:off x="0" y="0"/>
-                      <a:ext cx="5580000" cy="2442607"/>
-                    </a:xfrm>
-                    <a:prstGeom prst="rect">
-                      <a:avLst/>
-                    </a:prstGeom>
-                  </pic:spPr>
-                </pic:pic>
-              </a:graphicData>
-            </a:graphic>
-          </wp:inline>
-        </w:drawing>
-      </w:r>
-    </w:p>
-    <w:p>
-      <w:pPr>
-        <w:spacing w:after="0" w:line="360" w:lineRule="auto"/>
-        <w:jc w:val="center"/>
-        <w:rPr>
-          <w:rFonts w:cs="Times New Roman"/>
-          <w:sz w:val="28"/>
-          <w:szCs w:val="28"/>
-          <w:lang w:val="ru-RU"/>
-        </w:rPr>
-      </w:pPr>
-      <w:r>
-        <w:rPr>
-          <w:rFonts w:cs="Times New Roman"/>
-          <w:sz w:val="28"/>
-          <w:szCs w:val="28"/>
-          <w:lang w:val="ru-RU"/>
-        </w:rPr>
-        <w:t>Рисунок 3 – Удаление устаревших файлов кнопкой «</w:t>
-      </w:r>
-      <w:r>
-        <w:rPr>
-          <w:rFonts w:cs="Times New Roman"/>
-          <w:sz w:val="28"/>
-          <w:szCs w:val="28"/>
-        </w:rPr>
-        <w:t>Delete</w:t>
-      </w:r>
-      <w:r>
-        <w:rPr>
-          <w:rFonts w:cs="Times New Roman"/>
-          <w:sz w:val="28"/>
-          <w:szCs w:val="28"/>
-          <w:lang w:val="ru-RU"/>
-        </w:rPr>
-        <w:t>»</w:t>
-      </w:r>
-    </w:p>
-    <w:p>
-      <w:pPr>
-        <w:spacing w:after="0" w:line="360" w:lineRule="auto"/>
-        <w:ind w:firstLine="709"/>
-        <w:jc w:val="both"/>
-        <w:rPr>
-          <w:rFonts w:cs="Times New Roman"/>
-          <w:sz w:val="28"/>
-          <w:szCs w:val="28"/>
-          <w:lang w:val="ru-RU"/>
-        </w:rPr>
-      </w:pPr>
-      <w:r>
-        <w:rPr>
-          <w:rFonts w:cs="Times New Roman"/>
-          <w:bCs/>
-          <w:sz w:val="28"/>
-          <w:szCs w:val="28"/>
-          <w:lang w:val="ru-RU"/>
-        </w:rPr>
-        <w:t>Примечание</w:t>
-      </w:r>
-      <w:r>
-        <w:rPr>
-          <w:rFonts w:cs="Times New Roman"/>
-          <w:b/>
-          <w:sz w:val="28"/>
-          <w:szCs w:val="28"/>
-          <w:lang w:val="ru-RU"/>
-        </w:rPr>
-        <w:t xml:space="preserve"> </w:t>
-      </w:r>
-      <w:r>
-        <w:rPr>
-          <w:rFonts w:cs="Times New Roman"/>
-          <w:b/>
-          <w:sz w:val="28"/>
-          <w:szCs w:val="28"/>
-          <w:lang w:val="ru-RU"/>
-        </w:rPr>
-        <w:t>-</w:t>
-      </w:r>
-      <w:r>
-        <w:rPr>
-          <w:rFonts w:cs="Times New Roman"/>
-          <w:b/>
-          <w:sz w:val="28"/>
-          <w:szCs w:val="28"/>
-          <w:lang w:val="ru-RU"/>
-        </w:rPr>
-        <w:t xml:space="preserve"> </w:t>
-      </w:r>
-      <w:r>
-        <w:rPr>
-          <w:rFonts w:cs="Times New Roman"/>
-          <w:sz w:val="28"/>
-          <w:szCs w:val="28"/>
-          <w:lang w:val="ru-RU"/>
-        </w:rPr>
-        <w:t>п</w:t>
-      </w:r>
-      <w:r>
-        <w:rPr>
-          <w:rFonts w:cs="Times New Roman"/>
-          <w:sz w:val="28"/>
-          <w:szCs w:val="28"/>
-          <w:lang w:val="ru-RU"/>
-        </w:rPr>
-        <w:t xml:space="preserve">апка </w:t>
-      </w:r>
-      <w:r>
-        <w:rPr>
-          <w:rFonts w:cs="Times New Roman"/>
-          <w:b/>
-          <w:sz w:val="28"/>
-          <w:szCs w:val="28"/>
-        </w:rPr>
-        <w:t>default</w:t>
-      </w:r>
-      <w:r>
-        <w:rPr>
-          <w:rFonts w:cs="Times New Roman"/>
-          <w:sz w:val="28"/>
-          <w:szCs w:val="28"/>
-          <w:lang w:val="ru-RU"/>
-        </w:rPr>
-        <w:t xml:space="preserve"> перед загрузкой должна быть полностью очищена. Наличие нескольких файлов </w:t>
-      </w:r>
-      <w:r>
-        <w:rPr>
-          <w:rFonts w:cs="Times New Roman"/>
-          <w:sz w:val="28"/>
-          <w:szCs w:val="28"/>
-        </w:rPr>
-        <w:t>FAQ</w:t>
-      </w:r>
-      <w:r>
-        <w:rPr>
-          <w:rFonts w:cs="Times New Roman"/>
-          <w:sz w:val="28"/>
-          <w:szCs w:val="28"/>
-          <w:lang w:val="ru-RU"/>
-        </w:rPr>
-        <w:t xml:space="preserve"> одновременно недопустимо: это приводит к конфликтам версий и дублированию </w:t>
-      </w:r>
-      <w:r>
-        <w:rPr>
-          <w:rFonts w:cs="Times New Roman"/>
-          <w:sz w:val="28"/>
-          <w:szCs w:val="28"/>
-          <w:lang w:val="ru-RU"/>
-        </w:rPr>
-        <w:t>вопросов в боте</w:t>
-      </w:r>
-      <w:r>
-        <w:rPr>
-          <w:rFonts w:cs="Times New Roman"/>
-          <w:sz w:val="28"/>
-          <w:szCs w:val="28"/>
-          <w:lang w:val="ru-RU"/>
-        </w:rPr>
-        <w:t>.</w:t>
-      </w:r>
-    </w:p>
-    <w:p>
-      <w:pPr>
-        <w:spacing w:after="0" w:line="360" w:lineRule="auto"/>
-        <w:ind w:firstLine="709"/>
-        <w:jc w:val="both"/>
-        <w:rPr>
-          <w:rFonts w:cs="Times New Roman"/>
-          <w:sz w:val="28"/>
-          <w:szCs w:val="28"/>
-          <w:lang w:val="ru-RU"/>
-        </w:rPr>
-      </w:pPr>
-      <w:r>
-        <w:rPr>
-          <w:rFonts w:cs="Times New Roman"/>
-          <w:sz w:val="28"/>
-          <w:szCs w:val="28"/>
-          <w:lang w:val="ru-RU"/>
-        </w:rPr>
-        <w:t xml:space="preserve">2.5 Загрузите в очищенную папку подготовленный файл с вопросами и ответами (формата </w:t>
-      </w:r>
-      <w:r>
-        <w:rPr>
-          <w:rFonts w:cs="Times New Roman"/>
-          <w:sz w:val="28"/>
-          <w:szCs w:val="28"/>
-        </w:rPr>
-        <w:t>XLSX</w:t>
-      </w:r>
-      <w:r>
-        <w:rPr>
-          <w:rFonts w:cs="Times New Roman"/>
-          <w:sz w:val="28"/>
-          <w:szCs w:val="28"/>
-          <w:lang w:val="ru-RU"/>
-        </w:rPr>
-        <w:t xml:space="preserve">, например, </w:t>
-      </w:r>
-      <w:proofErr w:type="spellStart"/>
-      <w:r>
-        <w:rPr>
-          <w:rFonts w:cs="Times New Roman"/>
-          <w:b/>
-          <w:sz w:val="28"/>
-          <w:szCs w:val="28"/>
-        </w:rPr>
-        <w:t>NaSTya</w:t>
-      </w:r>
-      <w:proofErr w:type="spellEnd"/>
-      <w:r>
-        <w:rPr>
-          <w:rFonts w:cs="Times New Roman"/>
-          <w:b/>
-          <w:sz w:val="28"/>
-          <w:szCs w:val="28"/>
-          <w:lang w:val="ru-RU"/>
-        </w:rPr>
-        <w:t>_</w:t>
-      </w:r>
-      <w:r>
-        <w:rPr>
-          <w:rFonts w:cs="Times New Roman"/>
-          <w:b/>
-          <w:sz w:val="28"/>
-          <w:szCs w:val="28"/>
-        </w:rPr>
-        <w:t>FAQ</w:t>
-      </w:r>
-      <w:r>
-        <w:rPr>
-          <w:rFonts w:cs="Times New Roman"/>
-          <w:b/>
-          <w:sz w:val="28"/>
-          <w:szCs w:val="28"/>
-          <w:lang w:val="ru-RU"/>
-        </w:rPr>
-        <w:t>_</w:t>
-      </w:r>
-      <w:r>
-        <w:rPr>
-          <w:rFonts w:cs="Times New Roman"/>
-          <w:b/>
-          <w:sz w:val="28"/>
-          <w:szCs w:val="28"/>
-        </w:rPr>
-        <w:t>active</w:t>
-      </w:r>
-      <w:r>
-        <w:rPr>
-          <w:rFonts w:cs="Times New Roman"/>
-          <w:b/>
-          <w:sz w:val="28"/>
-          <w:szCs w:val="28"/>
-          <w:lang w:val="ru-RU"/>
-        </w:rPr>
-        <w:t>.</w:t>
-      </w:r>
-      <w:r>
-        <w:rPr>
-          <w:rFonts w:cs="Times New Roman"/>
-          <w:b/>
-          <w:sz w:val="28"/>
-          <w:szCs w:val="28"/>
-        </w:rPr>
-        <w:t>xlsx</w:t>
-      </w:r>
-      <w:r>
-        <w:rPr>
-          <w:rFonts w:cs="Times New Roman"/>
-          <w:sz w:val="28"/>
-          <w:szCs w:val="28"/>
-          <w:lang w:val="ru-RU"/>
-        </w:rPr>
-        <w:t xml:space="preserve">). Для этого перетащите файл из проводника в окно браузера либо нажмите кнопку </w:t>
-      </w:r>
-      <w:r>
-        <w:rPr>
-          <w:rFonts w:cs="Times New Roman"/>
-          <w:b/>
-          <w:sz w:val="28"/>
-          <w:szCs w:val="28"/>
-          <w:lang w:val="ru-RU"/>
-        </w:rPr>
-        <w:t>«</w:t>
-      </w:r>
-      <w:r>
-        <w:rPr>
-          <w:rFonts w:cs="Times New Roman"/>
-          <w:b/>
-          <w:sz w:val="28"/>
-          <w:szCs w:val="28"/>
-        </w:rPr>
-        <w:t>Add</w:t>
-      </w:r>
-      <w:r>
-        <w:rPr>
-          <w:rFonts w:cs="Times New Roman"/>
-          <w:b/>
-          <w:sz w:val="28"/>
-          <w:szCs w:val="28"/>
-          <w:lang w:val="ru-RU"/>
-        </w:rPr>
-        <w:t xml:space="preserve"> </w:t>
-      </w:r>
-      <w:r>
-        <w:rPr>
-          <w:rFonts w:cs="Times New Roman"/>
-          <w:b/>
-          <w:sz w:val="28"/>
-          <w:szCs w:val="28"/>
-        </w:rPr>
-        <w:t>files</w:t>
-      </w:r>
-      <w:r>
-        <w:rPr>
-          <w:rFonts w:cs="Times New Roman"/>
-          <w:b/>
-          <w:sz w:val="28"/>
-          <w:szCs w:val="28"/>
-          <w:lang w:val="ru-RU"/>
-        </w:rPr>
-        <w:t>»</w:t>
-      </w:r>
-      <w:r>
-        <w:rPr>
-          <w:rFonts w:cs="Times New Roman"/>
-          <w:sz w:val="28"/>
-          <w:szCs w:val="28"/>
-          <w:lang w:val="ru-RU"/>
-        </w:rPr>
-        <w:t xml:space="preserve"> в левом верхнем углу.</w:t>
-      </w:r>
-    </w:p>
-    <w:p>
-      <w:pPr>
-        <w:keepNext/>
-        <w:spacing w:after="0" w:line="360" w:lineRule="auto"/>
-        <w:ind w:firstLine="709"/>
-        <w:rPr>
-          <w:rFonts w:cs="Times New Roman"/>
-          <w:sz w:val="28"/>
-          <w:szCs w:val="28"/>
-          <w:lang w:val="ru-RU"/>
-        </w:rPr>
-      </w:pPr>
-      <w:r>
-        <w:rPr>
-          <w:rFonts w:cs="Times New Roman"/>
-          <w:b/>
-          <w:sz w:val="28"/>
-          <w:szCs w:val="28"/>
-          <w:lang w:val="ru-RU"/>
-        </w:rPr>
-        <w:t>3 Запуск принудительной синхронизации</w:t>
-      </w:r>
-    </w:p>
-    <w:p>
-      <w:pPr>
-        <w:spacing w:after="0" w:line="360" w:lineRule="auto"/>
-        <w:ind w:firstLine="709"/>
-        <w:jc w:val="both"/>
-        <w:rPr>
-          <w:rFonts w:cs="Times New Roman"/>
-          <w:sz w:val="28"/>
-          <w:szCs w:val="28"/>
-          <w:lang w:val="ru-RU"/>
-        </w:rPr>
-      </w:pPr>
-      <w:r>
-        <w:rPr>
-          <w:rFonts w:cs="Times New Roman"/>
-          <w:sz w:val="28"/>
-          <w:szCs w:val="28"/>
-          <w:lang w:val="ru-RU"/>
-        </w:rPr>
-        <w:t xml:space="preserve">3.1 Для </w:t>
-      </w:r>
-      <w:r>
-        <w:rPr>
-          <w:rFonts w:cs="Times New Roman"/>
-          <w:sz w:val="28"/>
-          <w:szCs w:val="28"/>
-          <w:lang w:val="ru-RU"/>
-        </w:rPr>
-        <w:t>того,</w:t>
-      </w:r>
-      <w:r>
-        <w:rPr>
-          <w:rFonts w:cs="Times New Roman"/>
-          <w:sz w:val="28"/>
-          <w:szCs w:val="28"/>
-          <w:lang w:val="ru-RU"/>
-        </w:rPr>
-        <w:t xml:space="preserve"> чтобы чат-бот применил изменения из загруженного файла, необходимо запустить синхронизацию базы данных. Откройте сервис </w:t>
-      </w:r>
-      <w:r>
-        <w:rPr>
-          <w:rFonts w:cs="Times New Roman"/>
-          <w:b/>
-          <w:sz w:val="28"/>
-          <w:szCs w:val="28"/>
-        </w:rPr>
-        <w:t>KB</w:t>
-      </w:r>
-      <w:r>
-        <w:rPr>
-          <w:rFonts w:cs="Times New Roman"/>
-          <w:b/>
-          <w:sz w:val="28"/>
-          <w:szCs w:val="28"/>
-          <w:lang w:val="ru-RU"/>
-        </w:rPr>
-        <w:t xml:space="preserve"> </w:t>
-      </w:r>
-      <w:r>
-        <w:rPr>
-          <w:rFonts w:cs="Times New Roman"/>
-          <w:b/>
-          <w:sz w:val="28"/>
-          <w:szCs w:val="28"/>
-        </w:rPr>
-        <w:t>Manager</w:t>
-      </w:r>
-      <w:r>
-        <w:rPr>
-          <w:rFonts w:cs="Times New Roman"/>
-          <w:sz w:val="28"/>
-          <w:szCs w:val="28"/>
-          <w:lang w:val="ru-RU"/>
-        </w:rPr>
-        <w:t xml:space="preserve"> по адресу: </w:t>
-      </w:r>
-      <w:r>
-        <w:rPr>
-          <w:rFonts w:cs="Times New Roman"/>
-          <w:b/>
-          <w:sz w:val="28"/>
-          <w:szCs w:val="28"/>
-        </w:rPr>
-        <w:t>https</w:t>
-      </w:r>
-      <w:r>
-        <w:rPr>
-          <w:rFonts w:cs="Times New Roman"/>
-          <w:b/>
-          <w:sz w:val="28"/>
-          <w:szCs w:val="28"/>
-          <w:lang w:val="ru-RU"/>
-        </w:rPr>
-        <w:t>://</w:t>
-      </w:r>
-      <w:r>
-        <w:rPr>
-          <w:rFonts w:cs="Times New Roman"/>
-          <w:b/>
-          <w:sz w:val="28"/>
-          <w:szCs w:val="28"/>
-        </w:rPr>
-        <w:t>kb</w:t>
-      </w:r>
-      <w:r>
-        <w:rPr>
-          <w:rFonts w:cs="Times New Roman"/>
-          <w:b/>
-          <w:sz w:val="28"/>
-          <w:szCs w:val="28"/>
-          <w:lang w:val="ru-RU"/>
-        </w:rPr>
-        <w:t>-</w:t>
-      </w:r>
-      <w:r>
-        <w:rPr>
-          <w:rFonts w:cs="Times New Roman"/>
-          <w:b/>
-          <w:sz w:val="28"/>
-          <w:szCs w:val="28"/>
-        </w:rPr>
-        <w:t>manager</w:t>
-      </w:r>
-      <w:r>
-        <w:rPr>
-          <w:rFonts w:cs="Times New Roman"/>
-          <w:b/>
-          <w:sz w:val="28"/>
-          <w:szCs w:val="28"/>
-          <w:lang w:val="ru-RU"/>
-        </w:rPr>
-        <w:t>-</w:t>
-      </w:r>
-      <w:r>
-        <w:rPr>
-          <w:rFonts w:cs="Times New Roman"/>
-          <w:b/>
-          <w:sz w:val="28"/>
-          <w:szCs w:val="28"/>
-        </w:rPr>
-        <w:t>chatbot</w:t>
-      </w:r>
-      <w:r>
-        <w:rPr>
-          <w:rFonts w:cs="Times New Roman"/>
-          <w:b/>
-          <w:sz w:val="28"/>
-          <w:szCs w:val="28"/>
-          <w:lang w:val="ru-RU"/>
-        </w:rPr>
-        <w:t>-</w:t>
-      </w:r>
-      <w:r>
-        <w:rPr>
-          <w:rFonts w:cs="Times New Roman"/>
-          <w:b/>
-          <w:sz w:val="28"/>
-          <w:szCs w:val="28"/>
-        </w:rPr>
-        <w:t>prod</w:t>
-      </w:r>
-      <w:r>
-        <w:rPr>
-          <w:rFonts w:cs="Times New Roman"/>
-          <w:b/>
-          <w:sz w:val="28"/>
-          <w:szCs w:val="28"/>
-          <w:lang w:val="ru-RU"/>
-        </w:rPr>
-        <w:t>.</w:t>
-      </w:r>
-      <w:proofErr w:type="spellStart"/>
-      <w:r>
-        <w:rPr>
-          <w:rFonts w:cs="Times New Roman"/>
-          <w:b/>
-          <w:sz w:val="28"/>
-          <w:szCs w:val="28"/>
-        </w:rPr>
-        <w:t>nstcloud</w:t>
-      </w:r>
-      <w:proofErr w:type="spellEnd"/>
-      <w:r>
-        <w:rPr>
-          <w:rFonts w:cs="Times New Roman"/>
-          <w:b/>
-          <w:sz w:val="28"/>
-          <w:szCs w:val="28"/>
-          <w:lang w:val="ru-RU"/>
-        </w:rPr>
-        <w:t>.</w:t>
-      </w:r>
-      <w:proofErr w:type="spellStart"/>
-      <w:r>
-        <w:rPr>
-          <w:rFonts w:cs="Times New Roman"/>
-          <w:b/>
-          <w:sz w:val="28"/>
-          <w:szCs w:val="28"/>
-        </w:rPr>
-        <w:t>ru</w:t>
-      </w:r>
-      <w:proofErr w:type="spellEnd"/>
-      <w:r>
-        <w:rPr>
-          <w:rFonts w:cs="Times New Roman"/>
-          <w:b/>
-          <w:sz w:val="28"/>
-          <w:szCs w:val="28"/>
-          <w:lang w:val="ru-RU"/>
-        </w:rPr>
-        <w:t>/</w:t>
-      </w:r>
-      <w:r>
-        <w:rPr>
-          <w:rFonts w:cs="Times New Roman"/>
-          <w:sz w:val="28"/>
-          <w:szCs w:val="28"/>
-          <w:lang w:val="ru-RU"/>
-        </w:rPr>
-        <w:t>.</w:t>
-      </w:r>
-    </w:p>
-    <w:p>
-      <w:pPr>
-        <w:spacing w:after="0" w:line="360" w:lineRule="auto"/>
-        <w:ind w:firstLine="709"/>
-        <w:jc w:val="both"/>
-        <w:rPr>
-          <w:rFonts w:cs="Times New Roman"/>
-          <w:sz w:val="28"/>
-          <w:szCs w:val="28"/>
-          <w:lang w:val="ru-RU"/>
-        </w:rPr>
-      </w:pPr>
-      <w:r>
-        <w:rPr>
-          <w:rFonts w:cs="Times New Roman"/>
-          <w:sz w:val="28"/>
-          <w:szCs w:val="28"/>
-          <w:lang w:val="ru-RU"/>
-        </w:rPr>
-        <w:t xml:space="preserve">3.2 В появившейся форме авторизации (рисунок 4) введите свое имя пользователя и пароль, после чего нажмите </w:t>
-      </w:r>
-      <w:r>
-        <w:rPr>
-          <w:rFonts w:cs="Times New Roman"/>
-          <w:b/>
-          <w:sz w:val="28"/>
-          <w:szCs w:val="28"/>
-          <w:lang w:val="ru-RU"/>
-        </w:rPr>
-        <w:t>«Войти»</w:t>
-      </w:r>
-      <w:r>
-        <w:rPr>
-          <w:rFonts w:cs="Times New Roman"/>
-          <w:sz w:val="28"/>
-          <w:szCs w:val="28"/>
-          <w:lang w:val="ru-RU"/>
-        </w:rPr>
-        <w:t>.</w:t>
-      </w:r>
-    </w:p>
-    <w:p>
-      <w:pPr>
-        <w:keepNext/>
-        <w:spacing w:before="120" w:after="60"/>
-        <w:jc w:val="center"/>
-        <w:rPr>
-          <w:rFonts w:cs="Times New Roman"/>
-          <w:sz w:val="28"/>
-          <w:szCs w:val="28"/>
-        </w:rPr>
-      </w:pPr>
-      <w:r>
-        <w:rPr>
-          <w:rFonts w:cs="Times New Roman"/>
-          <w:noProof/>
-          <w:sz w:val="28"/>
-          <w:szCs w:val="28"/>
-        </w:rPr>
-        <w:drawing>
-          <wp:inline distT="0" distB="0" distL="0" distR="0" wp14:anchorId="2C821A8E" wp14:editId="16417EAC">
+          <wp:inline distT="0" distB="0" distL="0" distR="0" wp14:anchorId="36737324" wp14:editId="0614F3DD">
             <wp:extent cx="2700000" cy="2012195"/>
             <wp:effectExtent l="0" t="0" r="0" b="0"/>
-            <wp:docPr id="4" name="Picture 4"/>
+            <wp:docPr id="9" name="Picture 9"/>
             <wp:cNvGraphicFramePr>
               <a:graphicFrameLocks xmlns:a="http://schemas.openxmlformats.org/drawingml/2006/main" noChangeAspect="1"/>
             </wp:cNvGraphicFramePr>
@@ -2007,7 +1207,7 @@
                     <pic:cNvPicPr/>
                   </pic:nvPicPr>
                   <pic:blipFill>
-                    <a:blip r:embed="rId11"/>
+                    <a:blip r:embed="rId8"/>
                     <a:stretch>
                       <a:fillRect/>
                     </a:stretch>
@@ -2046,7 +1246,25 @@
           <w:szCs w:val="28"/>
           <w:lang w:val="ru-RU"/>
         </w:rPr>
-        <w:t xml:space="preserve">Рисунок 4 – Окно авторизации в </w:t>
+        <w:t xml:space="preserve">Рисунок </w:t>
+      </w:r>
+      <w:r>
+        <w:rPr>
+          <w:rFonts w:cs="Times New Roman"/>
+          <w:sz w:val="28"/>
+          <w:szCs w:val="28"/>
+          <w:lang w:val="ru-RU"/>
+        </w:rPr>
+        <w:t>1</w:t>
+      </w:r>
+      <w:r>
+        <w:rPr>
+          <w:rFonts w:cs="Times New Roman"/>
+          <w:sz w:val="28"/>
+          <w:szCs w:val="28"/>
+          <w:lang w:val="ru-RU"/>
+        </w:rPr>
+        <w:t xml:space="preserve"> – Окно авторизации в </w:t>
       </w:r>
       <w:r>
         <w:rPr>
@@ -2093,8 +1311,1368 @@
           <w:szCs w:val="28"/>
           <w:lang w:val="ru-RU"/>
         </w:rPr>
+        <w:t xml:space="preserve"> </w:t>
+      </w:r>
+    </w:p>
+    <w:p>
+      <w:pPr>
+        <w:spacing w:after="0" w:line="360" w:lineRule="auto"/>
+        <w:ind w:firstLine="709"/>
+        <w:jc w:val="both"/>
+        <w:rPr>
+          <w:rFonts w:cs="Times New Roman"/>
+          <w:sz w:val="28"/>
+          <w:szCs w:val="28"/>
+          <w:lang w:val="ru-RU"/>
+        </w:rPr>
+      </w:pPr>
+      <w:r>
+        <w:rPr>
+          <w:rFonts w:cs="Times New Roman"/>
+          <w:sz w:val="28"/>
+          <w:szCs w:val="28"/>
+          <w:lang w:val="ru-RU"/>
+        </w:rPr>
+        <w:t>2.2 П</w:t>
+      </w:r>
+      <w:r>
+        <w:rPr>
+          <w:rFonts w:cs="Times New Roman"/>
+          <w:sz w:val="28"/>
+          <w:szCs w:val="28"/>
+          <w:lang w:val="ru-RU"/>
+        </w:rPr>
+        <w:t>ерейдите в</w:t>
+      </w:r>
+      <w:r>
+        <w:rPr>
+          <w:rFonts w:cs="Times New Roman"/>
+          <w:sz w:val="28"/>
+          <w:szCs w:val="28"/>
+          <w:lang w:val="ru-RU"/>
+        </w:rPr>
+        <w:t>о вкладку</w:t>
+      </w:r>
+      <w:r>
+        <w:rPr>
+          <w:rFonts w:cs="Times New Roman"/>
+          <w:sz w:val="28"/>
+          <w:szCs w:val="28"/>
+          <w:lang w:val="ru-RU"/>
+        </w:rPr>
+        <w:t xml:space="preserve"> </w:t>
+      </w:r>
+      <w:r>
+        <w:rPr>
+          <w:rFonts w:cs="Times New Roman"/>
+          <w:b/>
+          <w:bCs/>
+          <w:sz w:val="28"/>
+          <w:szCs w:val="28"/>
+          <w:lang w:val="ru-RU"/>
+        </w:rPr>
+        <w:t>Файловый менеджер</w:t>
+      </w:r>
+      <w:r>
+        <w:rPr>
+          <w:rFonts w:cs="Times New Roman"/>
+          <w:sz w:val="28"/>
+          <w:szCs w:val="28"/>
+          <w:lang w:val="ru-RU"/>
+        </w:rPr>
+        <w:t xml:space="preserve"> (рисунок </w:t>
+      </w:r>
+      <w:r>
+        <w:rPr>
+          <w:rFonts w:cs="Times New Roman"/>
+          <w:sz w:val="28"/>
+          <w:szCs w:val="28"/>
+          <w:lang w:val="ru-RU"/>
+        </w:rPr>
+        <w:t>2</w:t>
+      </w:r>
+      <w:r>
+        <w:rPr>
+          <w:rFonts w:cs="Times New Roman"/>
+          <w:sz w:val="28"/>
+          <w:szCs w:val="28"/>
+          <w:lang w:val="ru-RU"/>
+        </w:rPr>
+        <w:t xml:space="preserve">). Вас автоматически авторизирует внутри сервиса </w:t>
+      </w:r>
+      <w:proofErr w:type="spellStart"/>
+      <w:r>
+        <w:rPr>
+          <w:rFonts w:cs="Times New Roman"/>
+          <w:sz w:val="28"/>
+          <w:szCs w:val="28"/>
+          <w:lang w:val="en-GB"/>
+        </w:rPr>
+        <w:t>filegator</w:t>
+      </w:r>
+      <w:proofErr w:type="spellEnd"/>
+      <w:r>
+        <w:rPr>
+          <w:rFonts w:cs="Times New Roman"/>
+          <w:sz w:val="28"/>
+          <w:szCs w:val="28"/>
+          <w:lang w:val="ru-RU"/>
+        </w:rPr>
+        <w:t xml:space="preserve"> </w:t>
+      </w:r>
+      <w:r>
+        <w:rPr>
+          <w:rFonts w:cs="Times New Roman"/>
+          <w:sz w:val="28"/>
+          <w:szCs w:val="28"/>
+          <w:lang w:val="ru-RU"/>
+        </w:rPr>
+        <w:t xml:space="preserve">и дальше вы можете </w:t>
+      </w:r>
+      <w:r>
+        <w:rPr>
+          <w:rFonts w:cs="Times New Roman"/>
+          <w:sz w:val="28"/>
+          <w:szCs w:val="28"/>
+          <w:lang w:val="ru-RU"/>
+        </w:rPr>
+        <w:t xml:space="preserve">с ним </w:t>
+      </w:r>
+      <w:r>
+        <w:rPr>
+          <w:rFonts w:cs="Times New Roman"/>
+          <w:sz w:val="28"/>
+          <w:szCs w:val="28"/>
+          <w:lang w:val="ru-RU"/>
+        </w:rPr>
+        <w:t>взаимодействовать.</w:t>
+      </w:r>
+    </w:p>
+    <w:p>
+      <w:pPr>
+        <w:spacing w:after="0" w:line="360" w:lineRule="auto"/>
+        <w:ind w:firstLine="709"/>
+        <w:jc w:val="both"/>
+        <w:rPr>
+          <w:rFonts w:cs="Times New Roman"/>
+          <w:sz w:val="28"/>
+          <w:szCs w:val="28"/>
+          <w:lang w:val="ru-RU"/>
+        </w:rPr>
+      </w:pPr>
+      <w:r>
+        <w:rPr>
+          <w:rFonts w:cs="Times New Roman"/>
+          <w:sz w:val="28"/>
+          <w:szCs w:val="28"/>
+          <w:lang w:val="ru-RU"/>
+        </w:rPr>
+        <w:t>2.</w:t>
+      </w:r>
+      <w:r>
+        <w:rPr>
+          <w:rFonts w:cs="Times New Roman"/>
+          <w:sz w:val="28"/>
+          <w:szCs w:val="28"/>
+          <w:lang w:val="ru-RU"/>
+        </w:rPr>
+        <w:t>3</w:t>
+      </w:r>
+      <w:r>
+        <w:rPr>
+          <w:rFonts w:cs="Times New Roman"/>
+          <w:sz w:val="28"/>
+          <w:szCs w:val="28"/>
+          <w:lang w:val="ru-RU"/>
+        </w:rPr>
+        <w:t xml:space="preserve"> В корневом каталоге файлового менеджера перейдите в папку </w:t>
+      </w:r>
+      <w:proofErr w:type="spellStart"/>
+      <w:r>
+        <w:rPr>
+          <w:rFonts w:cs="Times New Roman"/>
+          <w:b/>
+          <w:sz w:val="28"/>
+          <w:szCs w:val="28"/>
+        </w:rPr>
+        <w:t>faq</w:t>
+      </w:r>
+      <w:proofErr w:type="spellEnd"/>
+      <w:r>
+        <w:rPr>
+          <w:rFonts w:cs="Times New Roman"/>
+          <w:sz w:val="28"/>
+          <w:szCs w:val="28"/>
+          <w:lang w:val="ru-RU"/>
+        </w:rPr>
+        <w:t xml:space="preserve"> (рисунок </w:t>
+      </w:r>
+      <w:r>
+        <w:rPr>
+          <w:rFonts w:cs="Times New Roman"/>
+          <w:sz w:val="28"/>
+          <w:szCs w:val="28"/>
+          <w:lang w:val="ru-RU"/>
+        </w:rPr>
+        <w:t>2</w:t>
+      </w:r>
+      <w:r>
+        <w:rPr>
+          <w:rFonts w:cs="Times New Roman"/>
+          <w:sz w:val="28"/>
+          <w:szCs w:val="28"/>
+          <w:lang w:val="ru-RU"/>
+        </w:rPr>
+        <w:t xml:space="preserve">), а внутри нее откройте папку </w:t>
+      </w:r>
+      <w:r>
+        <w:rPr>
+          <w:rFonts w:cs="Times New Roman"/>
+          <w:b/>
+          <w:sz w:val="28"/>
+          <w:szCs w:val="28"/>
+        </w:rPr>
+        <w:t>default</w:t>
+      </w:r>
+      <w:r>
+        <w:rPr>
+          <w:rFonts w:cs="Times New Roman"/>
+          <w:sz w:val="28"/>
+          <w:szCs w:val="28"/>
+          <w:lang w:val="ru-RU"/>
+        </w:rPr>
+        <w:t xml:space="preserve">. Рабочий путь в системе должен выглядеть следующим образом: </w:t>
+      </w:r>
+      <w:r>
+        <w:rPr>
+          <w:rFonts w:cs="Times New Roman"/>
+          <w:b/>
+          <w:sz w:val="28"/>
+          <w:szCs w:val="28"/>
+        </w:rPr>
+        <w:t>Home</w:t>
+      </w:r>
+      <w:r>
+        <w:rPr>
+          <w:rFonts w:cs="Times New Roman"/>
+          <w:b/>
+          <w:sz w:val="28"/>
+          <w:szCs w:val="28"/>
+          <w:lang w:val="ru-RU"/>
+        </w:rPr>
+        <w:t xml:space="preserve"> / </w:t>
+      </w:r>
+      <w:proofErr w:type="spellStart"/>
+      <w:r>
+        <w:rPr>
+          <w:rFonts w:cs="Times New Roman"/>
+          <w:b/>
+          <w:sz w:val="28"/>
+          <w:szCs w:val="28"/>
+        </w:rPr>
+        <w:t>faq</w:t>
+      </w:r>
+      <w:proofErr w:type="spellEnd"/>
+      <w:r>
+        <w:rPr>
+          <w:rFonts w:cs="Times New Roman"/>
+          <w:b/>
+          <w:sz w:val="28"/>
+          <w:szCs w:val="28"/>
+          <w:lang w:val="ru-RU"/>
+        </w:rPr>
+        <w:t xml:space="preserve"> / </w:t>
+      </w:r>
+      <w:r>
+        <w:rPr>
+          <w:rFonts w:cs="Times New Roman"/>
+          <w:b/>
+          <w:sz w:val="28"/>
+          <w:szCs w:val="28"/>
+        </w:rPr>
+        <w:t>default</w:t>
+      </w:r>
+    </w:p>
+    <w:p>
+      <w:pPr>
+        <w:spacing w:after="0" w:line="360" w:lineRule="auto"/>
+        <w:jc w:val="center"/>
+        <w:rPr>
+          <w:rFonts w:cs="Times New Roman"/>
+          <w:sz w:val="28"/>
+          <w:szCs w:val="28"/>
+          <w:lang w:val="ru-RU"/>
+        </w:rPr>
+      </w:pPr>
+      <w:r>
+        <w:rPr>
+          <w:rFonts w:cs="Times New Roman"/>
+          <w:sz w:val="28"/>
+          <w:szCs w:val="28"/>
+          <w:lang w:val="ru-RU"/>
+        </w:rPr>
+        <w:drawing>
+          <wp:anchor distT="0" distB="0" distL="114300" distR="114300" simplePos="0" relativeHeight="251658240" behindDoc="0" locked="0" layoutInCell="1" allowOverlap="1" wp14:anchorId="3E919BA4" wp14:editId="039E0FDE">
+            <wp:simplePos x="0" y="0"/>
+            <wp:positionH relativeFrom="margin">
+              <wp:align>right</wp:align>
+            </wp:positionH>
+            <wp:positionV relativeFrom="paragraph">
+              <wp:posOffset>19050</wp:posOffset>
+            </wp:positionV>
+            <wp:extent cx="5940425" cy="2954655"/>
+            <wp:effectExtent l="0" t="0" r="3175" b="0"/>
+            <wp:wrapSquare wrapText="bothSides"/>
+            <wp:docPr id="7" name="Picture 7"/>
+            <wp:cNvGraphicFramePr>
+              <a:graphicFrameLocks xmlns:a="http://schemas.openxmlformats.org/drawingml/2006/main" noChangeAspect="1"/>
+            </wp:cNvGraphicFramePr>
+            <a:graphic xmlns:a="http://schemas.openxmlformats.org/drawingml/2006/main">
+              <a:graphicData uri="http://schemas.openxmlformats.org/drawingml/2006/picture">
+                <pic:pic xmlns:pic="http://schemas.openxmlformats.org/drawingml/2006/picture">
+                  <pic:nvPicPr>
+                    <pic:cNvPr id="1" name=""/>
+                    <pic:cNvPicPr/>
+                  </pic:nvPicPr>
+                  <pic:blipFill>
+                    <a:blip r:embed="rId9"/>
+                    <a:stretch>
+                      <a:fillRect/>
+                    </a:stretch>
+                  </pic:blipFill>
+                  <pic:spPr>
+                    <a:xfrm>
+                      <a:off x="0" y="0"/>
+                      <a:ext cx="5940425" cy="2954655"/>
+                    </a:xfrm>
+                    <a:prstGeom prst="rect">
+                      <a:avLst/>
+                    </a:prstGeom>
+                  </pic:spPr>
+                </pic:pic>
+              </a:graphicData>
+            </a:graphic>
+          </wp:anchor>
+        </w:drawing>
+      </w:r>
+      <w:r>
+        <w:rPr>
+          <w:rFonts w:cs="Times New Roman"/>
+          <w:sz w:val="28"/>
+          <w:szCs w:val="28"/>
+          <w:lang w:val="ru-RU"/>
+        </w:rPr>
+        <w:t xml:space="preserve"> </w:t>
+      </w:r>
+      <w:r>
+        <w:rPr>
+          <w:rFonts w:cs="Times New Roman"/>
+          <w:sz w:val="28"/>
+          <w:szCs w:val="28"/>
+          <w:lang w:val="ru-RU"/>
+        </w:rPr>
+        <w:t xml:space="preserve">Рисунок </w:t>
+      </w:r>
+      <w:r>
+        <w:rPr>
+          <w:rFonts w:cs="Times New Roman"/>
+          <w:sz w:val="28"/>
+          <w:szCs w:val="28"/>
+          <w:lang w:val="ru-RU"/>
+        </w:rPr>
+        <w:t>2</w:t>
+      </w:r>
+      <w:r>
+        <w:rPr>
+          <w:rFonts w:cs="Times New Roman"/>
+          <w:sz w:val="28"/>
+          <w:szCs w:val="28"/>
+          <w:lang w:val="ru-RU"/>
+        </w:rPr>
+        <w:t xml:space="preserve"> – Выбор каталога </w:t>
+      </w:r>
+      <w:proofErr w:type="spellStart"/>
+      <w:r>
+        <w:rPr>
+          <w:rFonts w:cs="Times New Roman"/>
+          <w:sz w:val="28"/>
+          <w:szCs w:val="28"/>
+        </w:rPr>
+        <w:t>faq</w:t>
+      </w:r>
+      <w:proofErr w:type="spellEnd"/>
+      <w:r>
+        <w:rPr>
+          <w:rFonts w:cs="Times New Roman"/>
+          <w:sz w:val="28"/>
+          <w:szCs w:val="28"/>
+          <w:lang w:val="ru-RU"/>
+        </w:rPr>
+        <w:t xml:space="preserve"> в хранилище </w:t>
+      </w:r>
+      <w:proofErr w:type="spellStart"/>
+      <w:r>
+        <w:rPr>
+          <w:rFonts w:cs="Times New Roman"/>
+          <w:sz w:val="28"/>
+          <w:szCs w:val="28"/>
+        </w:rPr>
+        <w:t>FileGator</w:t>
+      </w:r>
+      <w:proofErr w:type="spellEnd"/>
+      <w:r>
+        <w:rPr>
+          <w:rFonts w:cs="Times New Roman"/>
+          <w:sz w:val="28"/>
+          <w:szCs w:val="28"/>
+          <w:lang w:val="ru-RU"/>
+        </w:rPr>
+        <w:t xml:space="preserve"> внутри интерфейса </w:t>
+      </w:r>
+      <w:r>
+        <w:rPr>
+          <w:rFonts w:cs="Times New Roman"/>
+          <w:sz w:val="28"/>
+          <w:szCs w:val="28"/>
+          <w:lang w:val="en-GB"/>
+        </w:rPr>
+        <w:t>kb</w:t>
+      </w:r>
+      <w:r>
+        <w:rPr>
+          <w:rFonts w:cs="Times New Roman"/>
+          <w:sz w:val="28"/>
+          <w:szCs w:val="28"/>
+          <w:lang w:val="ru-RU"/>
+        </w:rPr>
+        <w:t>-</w:t>
+      </w:r>
+      <w:r>
+        <w:rPr>
+          <w:rFonts w:cs="Times New Roman"/>
+          <w:sz w:val="28"/>
+          <w:szCs w:val="28"/>
+          <w:lang w:val="en-GB"/>
+        </w:rPr>
+        <w:t>manager</w:t>
+      </w:r>
+    </w:p>
+    <w:p>
+      <w:pPr>
+        <w:spacing w:after="0" w:line="360" w:lineRule="auto"/>
+        <w:ind w:firstLine="709"/>
+        <w:jc w:val="both"/>
+        <w:rPr>
+          <w:rFonts w:cs="Times New Roman"/>
+          <w:sz w:val="28"/>
+          <w:szCs w:val="28"/>
+          <w:lang w:val="ru-RU"/>
+        </w:rPr>
+      </w:pPr>
+      <w:r>
+        <w:rPr>
+          <w:rFonts w:cs="Times New Roman"/>
+          <w:sz w:val="28"/>
+          <w:szCs w:val="28"/>
+          <w:lang w:val="ru-RU"/>
+        </w:rPr>
+        <w:t xml:space="preserve">2.3 Перед загрузкой новой редакции вопросов обязательно удалите старые файлы. Нажмите на </w:t>
+      </w:r>
+      <w:r>
+        <w:rPr>
+          <w:rFonts w:cs="Times New Roman"/>
+          <w:b/>
+          <w:sz w:val="28"/>
+          <w:szCs w:val="28"/>
+          <w:lang w:val="ru-RU"/>
+        </w:rPr>
+        <w:t>чекбокс в левом верхнем углу таблицы</w:t>
+      </w:r>
+      <w:r>
+        <w:rPr>
+          <w:rFonts w:cs="Times New Roman"/>
+          <w:sz w:val="28"/>
+          <w:szCs w:val="28"/>
+          <w:lang w:val="ru-RU"/>
+        </w:rPr>
+        <w:t xml:space="preserve"> рядом с колонкой «</w:t>
+      </w:r>
+      <w:r>
+        <w:rPr>
+          <w:rFonts w:cs="Times New Roman"/>
+          <w:sz w:val="28"/>
+          <w:szCs w:val="28"/>
+        </w:rPr>
+        <w:t>Name</w:t>
+      </w:r>
+      <w:r>
+        <w:rPr>
+          <w:rFonts w:cs="Times New Roman"/>
+          <w:sz w:val="28"/>
+          <w:szCs w:val="28"/>
+          <w:lang w:val="ru-RU"/>
+        </w:rPr>
+        <w:t xml:space="preserve">» (рисунок </w:t>
+      </w:r>
+      <w:r>
+        <w:rPr>
+          <w:rFonts w:cs="Times New Roman"/>
+          <w:sz w:val="28"/>
+          <w:szCs w:val="28"/>
+          <w:lang w:val="ru-RU"/>
+        </w:rPr>
+        <w:t>3</w:t>
+      </w:r>
+      <w:r>
+        <w:rPr>
+          <w:rFonts w:cs="Times New Roman"/>
+          <w:sz w:val="28"/>
+          <w:szCs w:val="28"/>
+          <w:lang w:val="ru-RU"/>
+        </w:rPr>
+        <w:t>), чтобы выделить все находящиеся в каталоге файлы и папки.</w:t>
+      </w:r>
+    </w:p>
+    <w:p>
+      <w:pPr>
+        <w:keepNext/>
+        <w:spacing w:before="120" w:after="60"/>
+        <w:jc w:val="center"/>
+        <w:rPr>
+          <w:rFonts w:cs="Times New Roman"/>
+          <w:sz w:val="28"/>
+          <w:szCs w:val="28"/>
+        </w:rPr>
+      </w:pPr>
+      <w:r>
+        <w:rPr>
+          <w:rFonts w:cs="Times New Roman"/>
+          <w:noProof/>
+          <w:sz w:val="28"/>
+          <w:szCs w:val="28"/>
+        </w:rPr>
         <w:lastRenderedPageBreak/>
-        <w:t xml:space="preserve">3.3 На главной странице интерфейса в правой верхней части над деревом файлов нажмите кнопку </w:t>
+        <w:drawing>
+          <wp:inline distT="0" distB="0" distL="0" distR="0" wp14:anchorId="053D9AEF" wp14:editId="276D75C7">
+            <wp:extent cx="5940425" cy="2562860"/>
+            <wp:effectExtent l="0" t="0" r="3175" b="8890"/>
+            <wp:docPr id="1" name="Picture 1"/>
+            <wp:cNvGraphicFramePr>
+              <a:graphicFrameLocks xmlns:a="http://schemas.openxmlformats.org/drawingml/2006/main" noChangeAspect="1"/>
+            </wp:cNvGraphicFramePr>
+            <a:graphic xmlns:a="http://schemas.openxmlformats.org/drawingml/2006/main">
+              <a:graphicData uri="http://schemas.openxmlformats.org/drawingml/2006/picture">
+                <pic:pic xmlns:pic="http://schemas.openxmlformats.org/drawingml/2006/picture">
+                  <pic:nvPicPr>
+                    <pic:cNvPr id="1" name=""/>
+                    <pic:cNvPicPr/>
+                  </pic:nvPicPr>
+                  <pic:blipFill>
+                    <a:blip r:embed="rId10"/>
+                    <a:stretch>
+                      <a:fillRect/>
+                    </a:stretch>
+                  </pic:blipFill>
+                  <pic:spPr>
+                    <a:xfrm>
+                      <a:off x="0" y="0"/>
+                      <a:ext cx="5940425" cy="2562860"/>
+                    </a:xfrm>
+                    <a:prstGeom prst="rect">
+                      <a:avLst/>
+                    </a:prstGeom>
+                  </pic:spPr>
+                </pic:pic>
+              </a:graphicData>
+            </a:graphic>
+          </wp:inline>
+        </w:drawing>
+      </w:r>
+      <w:r>
+        <w:rPr>
+          <w:rFonts w:cs="Times New Roman"/>
+          <w:noProof/>
+          <w:sz w:val="28"/>
+          <w:szCs w:val="28"/>
+        </w:rPr>
+        <w:t xml:space="preserve"> </w:t>
+      </w:r>
+    </w:p>
+    <w:p>
+      <w:pPr>
+        <w:spacing w:after="0" w:line="360" w:lineRule="auto"/>
+        <w:jc w:val="center"/>
+        <w:rPr>
+          <w:rFonts w:cs="Times New Roman"/>
+          <w:sz w:val="28"/>
+          <w:szCs w:val="28"/>
+          <w:lang w:val="ru-RU"/>
+        </w:rPr>
+      </w:pPr>
+      <w:r>
+        <w:rPr>
+          <w:rFonts w:cs="Times New Roman"/>
+          <w:sz w:val="28"/>
+          <w:szCs w:val="28"/>
+          <w:lang w:val="ru-RU"/>
+        </w:rPr>
+        <w:t xml:space="preserve">Рисунок </w:t>
+      </w:r>
+      <w:r>
+        <w:rPr>
+          <w:rFonts w:cs="Times New Roman"/>
+          <w:sz w:val="28"/>
+          <w:szCs w:val="28"/>
+          <w:lang w:val="ru-RU"/>
+        </w:rPr>
+        <w:t>3</w:t>
+      </w:r>
+      <w:r>
+        <w:rPr>
+          <w:rFonts w:cs="Times New Roman"/>
+          <w:sz w:val="28"/>
+          <w:szCs w:val="28"/>
+          <w:lang w:val="ru-RU"/>
+        </w:rPr>
+        <w:t xml:space="preserve"> – Кнопка группового выделения содержимого папки</w:t>
+      </w:r>
+    </w:p>
+    <w:p>
+      <w:pPr>
+        <w:spacing w:after="0" w:line="360" w:lineRule="auto"/>
+        <w:ind w:firstLine="709"/>
+        <w:jc w:val="both"/>
+        <w:rPr>
+          <w:rFonts w:cs="Times New Roman"/>
+          <w:sz w:val="28"/>
+          <w:szCs w:val="28"/>
+          <w:lang w:val="ru-RU"/>
+        </w:rPr>
+      </w:pPr>
+      <w:r>
+        <w:rPr>
+          <w:rFonts w:cs="Times New Roman"/>
+          <w:sz w:val="28"/>
+          <w:szCs w:val="28"/>
+          <w:lang w:val="ru-RU"/>
+        </w:rPr>
+        <w:t xml:space="preserve">2.4 После </w:t>
+      </w:r>
+      <w:r>
+        <w:rPr>
+          <w:rFonts w:cs="Times New Roman"/>
+          <w:sz w:val="28"/>
+          <w:szCs w:val="28"/>
+          <w:lang w:val="ru-RU"/>
+        </w:rPr>
+        <w:t>того,</w:t>
+      </w:r>
+      <w:r>
+        <w:rPr>
+          <w:rFonts w:cs="Times New Roman"/>
+          <w:sz w:val="28"/>
+          <w:szCs w:val="28"/>
+          <w:lang w:val="ru-RU"/>
+        </w:rPr>
+        <w:t xml:space="preserve"> как файлы выделились (отметились зелеными маркерами), нажмите кнопку </w:t>
+      </w:r>
+      <w:r>
+        <w:rPr>
+          <w:rFonts w:cs="Times New Roman"/>
+          <w:b/>
+          <w:sz w:val="28"/>
+          <w:szCs w:val="28"/>
+          <w:lang w:val="ru-RU"/>
+        </w:rPr>
+        <w:t>«</w:t>
+      </w:r>
+      <w:r>
+        <w:rPr>
+          <w:rFonts w:cs="Times New Roman"/>
+          <w:b/>
+          <w:sz w:val="28"/>
+          <w:szCs w:val="28"/>
+        </w:rPr>
+        <w:t>Delete</w:t>
+      </w:r>
+      <w:r>
+        <w:rPr>
+          <w:rFonts w:cs="Times New Roman"/>
+          <w:b/>
+          <w:sz w:val="28"/>
+          <w:szCs w:val="28"/>
+          <w:lang w:val="ru-RU"/>
+        </w:rPr>
+        <w:t>»</w:t>
+      </w:r>
+      <w:r>
+        <w:rPr>
+          <w:rFonts w:cs="Times New Roman"/>
+          <w:sz w:val="28"/>
+          <w:szCs w:val="28"/>
+          <w:lang w:val="ru-RU"/>
+        </w:rPr>
+        <w:t xml:space="preserve"> на верхней панели действий (рисунок </w:t>
+      </w:r>
+      <w:r>
+        <w:rPr>
+          <w:rFonts w:cs="Times New Roman"/>
+          <w:sz w:val="28"/>
+          <w:szCs w:val="28"/>
+          <w:lang w:val="ru-RU"/>
+        </w:rPr>
+        <w:t>4</w:t>
+      </w:r>
+      <w:r>
+        <w:rPr>
+          <w:rFonts w:cs="Times New Roman"/>
+          <w:sz w:val="28"/>
+          <w:szCs w:val="28"/>
+          <w:lang w:val="ru-RU"/>
+        </w:rPr>
+        <w:t>) и подтвердите удаление.</w:t>
+      </w:r>
+    </w:p>
+    <w:p>
+      <w:pPr>
+        <w:keepNext/>
+        <w:spacing w:before="120" w:after="60"/>
+        <w:jc w:val="center"/>
+        <w:rPr>
+          <w:rFonts w:cs="Times New Roman"/>
+          <w:sz w:val="28"/>
+          <w:szCs w:val="28"/>
+          <w:lang w:val="ru-RU"/>
+        </w:rPr>
+      </w:pPr>
+      <w:r>
+        <w:rPr>
+          <w:rFonts w:cs="Times New Roman"/>
+          <w:noProof/>
+          <w:sz w:val="28"/>
+          <w:szCs w:val="28"/>
+        </w:rPr>
+        <w:drawing>
+          <wp:inline distT="0" distB="0" distL="0" distR="0" wp14:anchorId="6703F895" wp14:editId="1E644778">
+            <wp:extent cx="5940425" cy="2528570"/>
+            <wp:effectExtent l="0" t="0" r="3175" b="5080"/>
+            <wp:docPr id="8" name="Picture 8"/>
+            <wp:cNvGraphicFramePr>
+              <a:graphicFrameLocks xmlns:a="http://schemas.openxmlformats.org/drawingml/2006/main" noChangeAspect="1"/>
+            </wp:cNvGraphicFramePr>
+            <a:graphic xmlns:a="http://schemas.openxmlformats.org/drawingml/2006/main">
+              <a:graphicData uri="http://schemas.openxmlformats.org/drawingml/2006/picture">
+                <pic:pic xmlns:pic="http://schemas.openxmlformats.org/drawingml/2006/picture">
+                  <pic:nvPicPr>
+                    <pic:cNvPr id="1" name=""/>
+                    <pic:cNvPicPr/>
+                  </pic:nvPicPr>
+                  <pic:blipFill>
+                    <a:blip r:embed="rId11"/>
+                    <a:stretch>
+                      <a:fillRect/>
+                    </a:stretch>
+                  </pic:blipFill>
+                  <pic:spPr>
+                    <a:xfrm>
+                      <a:off x="0" y="0"/>
+                      <a:ext cx="5940425" cy="2528570"/>
+                    </a:xfrm>
+                    <a:prstGeom prst="rect">
+                      <a:avLst/>
+                    </a:prstGeom>
+                  </pic:spPr>
+                </pic:pic>
+              </a:graphicData>
+            </a:graphic>
+          </wp:inline>
+        </w:drawing>
+      </w:r>
+      <w:r>
+        <w:rPr>
+          <w:rFonts w:cs="Times New Roman"/>
+          <w:noProof/>
+          <w:sz w:val="28"/>
+          <w:szCs w:val="28"/>
+          <w:lang w:val="ru-RU"/>
+        </w:rPr>
+        <w:t xml:space="preserve"> </w:t>
+      </w:r>
+    </w:p>
+    <w:p>
+      <w:pPr>
+        <w:spacing w:after="0" w:line="360" w:lineRule="auto"/>
+        <w:jc w:val="center"/>
+        <w:rPr>
+          <w:rFonts w:cs="Times New Roman"/>
+          <w:sz w:val="28"/>
+          <w:szCs w:val="28"/>
+          <w:lang w:val="ru-RU"/>
+        </w:rPr>
+      </w:pPr>
+      <w:r>
+        <w:rPr>
+          <w:rFonts w:cs="Times New Roman"/>
+          <w:sz w:val="28"/>
+          <w:szCs w:val="28"/>
+          <w:lang w:val="ru-RU"/>
+        </w:rPr>
+        <w:t xml:space="preserve">Рисунок </w:t>
+      </w:r>
+      <w:r>
+        <w:rPr>
+          <w:rFonts w:cs="Times New Roman"/>
+          <w:sz w:val="28"/>
+          <w:szCs w:val="28"/>
+          <w:lang w:val="ru-RU"/>
+        </w:rPr>
+        <w:t>4</w:t>
+      </w:r>
+      <w:r>
+        <w:rPr>
+          <w:rFonts w:cs="Times New Roman"/>
+          <w:sz w:val="28"/>
+          <w:szCs w:val="28"/>
+          <w:lang w:val="ru-RU"/>
+        </w:rPr>
+        <w:t xml:space="preserve"> – Удаление устаревших файлов кнопкой «</w:t>
+      </w:r>
+      <w:r>
+        <w:rPr>
+          <w:rFonts w:cs="Times New Roman"/>
+          <w:sz w:val="28"/>
+          <w:szCs w:val="28"/>
+        </w:rPr>
+        <w:t>Delete</w:t>
+      </w:r>
+      <w:r>
+        <w:rPr>
+          <w:rFonts w:cs="Times New Roman"/>
+          <w:sz w:val="28"/>
+          <w:szCs w:val="28"/>
+          <w:lang w:val="ru-RU"/>
+        </w:rPr>
+        <w:t>»</w:t>
+      </w:r>
+    </w:p>
+    <w:p>
+      <w:pPr>
+        <w:spacing w:after="0" w:line="360" w:lineRule="auto"/>
+        <w:ind w:firstLine="709"/>
+        <w:jc w:val="both"/>
+        <w:rPr>
+          <w:rFonts w:cs="Times New Roman"/>
+          <w:sz w:val="28"/>
+          <w:szCs w:val="28"/>
+          <w:lang w:val="ru-RU"/>
+        </w:rPr>
+      </w:pPr>
+      <w:r>
+        <w:rPr>
+          <w:rFonts w:cs="Times New Roman"/>
+          <w:bCs/>
+          <w:sz w:val="28"/>
+          <w:szCs w:val="28"/>
+          <w:lang w:val="ru-RU"/>
+        </w:rPr>
+        <w:t>Примечание</w:t>
+      </w:r>
+      <w:r>
+        <w:rPr>
+          <w:rFonts w:cs="Times New Roman"/>
+          <w:b/>
+          <w:sz w:val="28"/>
+          <w:szCs w:val="28"/>
+          <w:lang w:val="ru-RU"/>
+        </w:rPr>
+        <w:t xml:space="preserve"> </w:t>
+      </w:r>
+      <w:r>
+        <w:rPr>
+          <w:rFonts w:cs="Times New Roman"/>
+          <w:b/>
+          <w:sz w:val="28"/>
+          <w:szCs w:val="28"/>
+          <w:lang w:val="ru-RU"/>
+        </w:rPr>
+        <w:t>-</w:t>
+      </w:r>
+      <w:r>
+        <w:rPr>
+          <w:rFonts w:cs="Times New Roman"/>
+          <w:b/>
+          <w:sz w:val="28"/>
+          <w:szCs w:val="28"/>
+          <w:lang w:val="ru-RU"/>
+        </w:rPr>
+        <w:t xml:space="preserve"> </w:t>
+      </w:r>
+      <w:r>
+        <w:rPr>
+          <w:rFonts w:cs="Times New Roman"/>
+          <w:sz w:val="28"/>
+          <w:szCs w:val="28"/>
+          <w:lang w:val="ru-RU"/>
+        </w:rPr>
+        <w:t>п</w:t>
+      </w:r>
+      <w:r>
+        <w:rPr>
+          <w:rFonts w:cs="Times New Roman"/>
+          <w:sz w:val="28"/>
+          <w:szCs w:val="28"/>
+          <w:lang w:val="ru-RU"/>
+        </w:rPr>
+        <w:t xml:space="preserve">апка </w:t>
+      </w:r>
+      <w:r>
+        <w:rPr>
+          <w:rFonts w:cs="Times New Roman"/>
+          <w:b/>
+          <w:sz w:val="28"/>
+          <w:szCs w:val="28"/>
+        </w:rPr>
+        <w:t>default</w:t>
+      </w:r>
+      <w:r>
+        <w:rPr>
+          <w:rFonts w:cs="Times New Roman"/>
+          <w:sz w:val="28"/>
+          <w:szCs w:val="28"/>
+          <w:lang w:val="ru-RU"/>
+        </w:rPr>
+        <w:t xml:space="preserve"> перед загрузкой должна быть полностью очищена. Наличие нескольких файлов </w:t>
+      </w:r>
+      <w:r>
+        <w:rPr>
+          <w:rFonts w:cs="Times New Roman"/>
+          <w:sz w:val="28"/>
+          <w:szCs w:val="28"/>
+        </w:rPr>
+        <w:t>FAQ</w:t>
+      </w:r>
+      <w:r>
+        <w:rPr>
+          <w:rFonts w:cs="Times New Roman"/>
+          <w:sz w:val="28"/>
+          <w:szCs w:val="28"/>
+          <w:lang w:val="ru-RU"/>
+        </w:rPr>
+        <w:t xml:space="preserve"> одновременно недопустимо: это приводит к конфликтам версий и дублированию </w:t>
+      </w:r>
+      <w:r>
+        <w:rPr>
+          <w:rFonts w:cs="Times New Roman"/>
+          <w:sz w:val="28"/>
+          <w:szCs w:val="28"/>
+          <w:lang w:val="ru-RU"/>
+        </w:rPr>
+        <w:t>вопросов в боте</w:t>
+      </w:r>
+      <w:r>
+        <w:rPr>
+          <w:rFonts w:cs="Times New Roman"/>
+          <w:sz w:val="28"/>
+          <w:szCs w:val="28"/>
+          <w:lang w:val="ru-RU"/>
+        </w:rPr>
+        <w:t>.</w:t>
+      </w:r>
+    </w:p>
+    <w:p>
+      <w:pPr>
+        <w:spacing w:after="0" w:line="360" w:lineRule="auto"/>
+        <w:ind w:firstLine="709"/>
+        <w:jc w:val="both"/>
+        <w:rPr>
+          <w:rFonts w:cs="Times New Roman"/>
+          <w:sz w:val="28"/>
+          <w:szCs w:val="28"/>
+          <w:lang w:val="ru-RU"/>
+        </w:rPr>
+      </w:pPr>
+      <w:r>
+        <w:rPr>
+          <w:rFonts w:cs="Times New Roman"/>
+          <w:sz w:val="28"/>
+          <w:szCs w:val="28"/>
+          <w:lang w:val="ru-RU"/>
+        </w:rPr>
+        <w:t xml:space="preserve">2.5 Загрузите в очищенную папку подготовленный файл с вопросами и ответами (формата </w:t>
+      </w:r>
+      <w:r>
+        <w:rPr>
+          <w:rFonts w:cs="Times New Roman"/>
+          <w:sz w:val="28"/>
+          <w:szCs w:val="28"/>
+        </w:rPr>
+        <w:t>XLSX</w:t>
+      </w:r>
+      <w:r>
+        <w:rPr>
+          <w:rFonts w:cs="Times New Roman"/>
+          <w:sz w:val="28"/>
+          <w:szCs w:val="28"/>
+          <w:lang w:val="ru-RU"/>
+        </w:rPr>
+        <w:t xml:space="preserve">, например, </w:t>
+      </w:r>
+      <w:proofErr w:type="spellStart"/>
+      <w:r>
+        <w:rPr>
+          <w:rFonts w:cs="Times New Roman"/>
+          <w:b/>
+          <w:sz w:val="28"/>
+          <w:szCs w:val="28"/>
+        </w:rPr>
+        <w:t>NaSTya</w:t>
+      </w:r>
+      <w:proofErr w:type="spellEnd"/>
+      <w:r>
+        <w:rPr>
+          <w:rFonts w:cs="Times New Roman"/>
+          <w:b/>
+          <w:sz w:val="28"/>
+          <w:szCs w:val="28"/>
+          <w:lang w:val="ru-RU"/>
+        </w:rPr>
+        <w:t>_</w:t>
+      </w:r>
+      <w:r>
+        <w:rPr>
+          <w:rFonts w:cs="Times New Roman"/>
+          <w:b/>
+          <w:sz w:val="28"/>
+          <w:szCs w:val="28"/>
+        </w:rPr>
+        <w:t>FAQ</w:t>
+      </w:r>
+      <w:r>
+        <w:rPr>
+          <w:rFonts w:cs="Times New Roman"/>
+          <w:b/>
+          <w:sz w:val="28"/>
+          <w:szCs w:val="28"/>
+          <w:lang w:val="ru-RU"/>
+        </w:rPr>
+        <w:t>_</w:t>
+      </w:r>
+      <w:r>
+        <w:rPr>
+          <w:rFonts w:cs="Times New Roman"/>
+          <w:b/>
+          <w:sz w:val="28"/>
+          <w:szCs w:val="28"/>
+        </w:rPr>
+        <w:t>active</w:t>
+      </w:r>
+      <w:r>
+        <w:rPr>
+          <w:rFonts w:cs="Times New Roman"/>
+          <w:b/>
+          <w:sz w:val="28"/>
+          <w:szCs w:val="28"/>
+          <w:lang w:val="ru-RU"/>
+        </w:rPr>
+        <w:t>.</w:t>
+      </w:r>
+      <w:r>
+        <w:rPr>
+          <w:rFonts w:cs="Times New Roman"/>
+          <w:b/>
+          <w:sz w:val="28"/>
+          <w:szCs w:val="28"/>
+        </w:rPr>
+        <w:t>xlsx</w:t>
+      </w:r>
+      <w:r>
+        <w:rPr>
+          <w:rFonts w:cs="Times New Roman"/>
+          <w:sz w:val="28"/>
+          <w:szCs w:val="28"/>
+          <w:lang w:val="ru-RU"/>
+        </w:rPr>
+        <w:t xml:space="preserve">). Для этого перетащите файл из проводника в окно браузера либо нажмите кнопку </w:t>
+      </w:r>
+      <w:r>
+        <w:rPr>
+          <w:rFonts w:cs="Times New Roman"/>
+          <w:b/>
+          <w:sz w:val="28"/>
+          <w:szCs w:val="28"/>
+          <w:lang w:val="ru-RU"/>
+        </w:rPr>
+        <w:t>«</w:t>
+      </w:r>
+      <w:r>
+        <w:rPr>
+          <w:rFonts w:cs="Times New Roman"/>
+          <w:b/>
+          <w:sz w:val="28"/>
+          <w:szCs w:val="28"/>
+        </w:rPr>
+        <w:t>Add</w:t>
+      </w:r>
+      <w:r>
+        <w:rPr>
+          <w:rFonts w:cs="Times New Roman"/>
+          <w:b/>
+          <w:sz w:val="28"/>
+          <w:szCs w:val="28"/>
+          <w:lang w:val="ru-RU"/>
+        </w:rPr>
+        <w:t xml:space="preserve"> </w:t>
+      </w:r>
+      <w:r>
+        <w:rPr>
+          <w:rFonts w:cs="Times New Roman"/>
+          <w:b/>
+          <w:sz w:val="28"/>
+          <w:szCs w:val="28"/>
+        </w:rPr>
+        <w:t>files</w:t>
+      </w:r>
+      <w:r>
+        <w:rPr>
+          <w:rFonts w:cs="Times New Roman"/>
+          <w:b/>
+          <w:sz w:val="28"/>
+          <w:szCs w:val="28"/>
+          <w:lang w:val="ru-RU"/>
+        </w:rPr>
+        <w:t>»</w:t>
+      </w:r>
+      <w:r>
+        <w:rPr>
+          <w:rFonts w:cs="Times New Roman"/>
+          <w:sz w:val="28"/>
+          <w:szCs w:val="28"/>
+          <w:lang w:val="ru-RU"/>
+        </w:rPr>
+        <w:t xml:space="preserve"> в левом верхнем углу.</w:t>
+      </w:r>
+    </w:p>
+    <w:p>
+      <w:pPr>
+        <w:keepNext/>
+        <w:spacing w:after="0" w:line="360" w:lineRule="auto"/>
+        <w:ind w:firstLine="709"/>
+        <w:rPr>
+          <w:rFonts w:cs="Times New Roman"/>
+          <w:sz w:val="28"/>
+          <w:szCs w:val="28"/>
+          <w:lang w:val="ru-RU"/>
+        </w:rPr>
+      </w:pPr>
+      <w:r>
+        <w:rPr>
+          <w:rFonts w:cs="Times New Roman"/>
+          <w:b/>
+          <w:sz w:val="28"/>
+          <w:szCs w:val="28"/>
+          <w:lang w:val="ru-RU"/>
+        </w:rPr>
+        <w:lastRenderedPageBreak/>
+        <w:t>3 Запуск принудительной синхронизации</w:t>
+      </w:r>
+    </w:p>
+    <w:p>
+      <w:pPr>
+        <w:spacing w:after="0" w:line="360" w:lineRule="auto"/>
+        <w:ind w:firstLine="709"/>
+        <w:jc w:val="both"/>
+        <w:rPr>
+          <w:rFonts w:cs="Times New Roman"/>
+          <w:sz w:val="28"/>
+          <w:szCs w:val="28"/>
+          <w:lang w:val="ru-RU"/>
+        </w:rPr>
+      </w:pPr>
+      <w:r>
+        <w:rPr>
+          <w:rFonts w:cs="Times New Roman"/>
+          <w:sz w:val="28"/>
+          <w:szCs w:val="28"/>
+          <w:lang w:val="ru-RU"/>
+        </w:rPr>
+        <w:t xml:space="preserve">3.1 Для </w:t>
+      </w:r>
+      <w:r>
+        <w:rPr>
+          <w:rFonts w:cs="Times New Roman"/>
+          <w:sz w:val="28"/>
+          <w:szCs w:val="28"/>
+          <w:lang w:val="ru-RU"/>
+        </w:rPr>
+        <w:t>того,</w:t>
+      </w:r>
+      <w:r>
+        <w:rPr>
+          <w:rFonts w:cs="Times New Roman"/>
+          <w:sz w:val="28"/>
+          <w:szCs w:val="28"/>
+          <w:lang w:val="ru-RU"/>
+        </w:rPr>
+        <w:t xml:space="preserve"> чтобы чат-бот применил изменения из загруженного файла, необходимо запустить синхронизацию базы данных. </w:t>
+      </w:r>
+      <w:r>
+        <w:rPr>
+          <w:rFonts w:cs="Times New Roman"/>
+          <w:sz w:val="28"/>
+          <w:szCs w:val="28"/>
+          <w:lang w:val="ru-RU"/>
+        </w:rPr>
+        <w:t xml:space="preserve">Для этого внутри </w:t>
+      </w:r>
+      <w:r>
+        <w:rPr>
+          <w:rFonts w:cs="Times New Roman"/>
+          <w:sz w:val="28"/>
+          <w:szCs w:val="28"/>
+          <w:lang w:val="ru-RU"/>
+        </w:rPr>
+        <w:t>сервис</w:t>
+      </w:r>
+      <w:r>
+        <w:rPr>
+          <w:rFonts w:cs="Times New Roman"/>
+          <w:sz w:val="28"/>
+          <w:szCs w:val="28"/>
+          <w:lang w:val="ru-RU"/>
+        </w:rPr>
+        <w:t>а</w:t>
+      </w:r>
+      <w:r>
+        <w:rPr>
+          <w:rFonts w:cs="Times New Roman"/>
+          <w:sz w:val="28"/>
+          <w:szCs w:val="28"/>
+          <w:lang w:val="ru-RU"/>
+        </w:rPr>
+        <w:t xml:space="preserve"> </w:t>
+      </w:r>
+      <w:r>
+        <w:rPr>
+          <w:rFonts w:cs="Times New Roman"/>
+          <w:b/>
+          <w:sz w:val="28"/>
+          <w:szCs w:val="28"/>
+        </w:rPr>
+        <w:t>KB</w:t>
+      </w:r>
+      <w:r>
+        <w:rPr>
+          <w:rFonts w:cs="Times New Roman"/>
+          <w:b/>
+          <w:sz w:val="28"/>
+          <w:szCs w:val="28"/>
+          <w:lang w:val="ru-RU"/>
+        </w:rPr>
+        <w:t xml:space="preserve"> </w:t>
+      </w:r>
+      <w:r>
+        <w:rPr>
+          <w:rFonts w:cs="Times New Roman"/>
+          <w:b/>
+          <w:sz w:val="28"/>
+          <w:szCs w:val="28"/>
+        </w:rPr>
+        <w:t>Manager</w:t>
+      </w:r>
+      <w:r>
+        <w:rPr>
+          <w:rFonts w:cs="Times New Roman"/>
+          <w:sz w:val="28"/>
+          <w:szCs w:val="28"/>
+          <w:lang w:val="ru-RU"/>
+        </w:rPr>
+        <w:t xml:space="preserve"> </w:t>
+      </w:r>
+      <w:r>
+        <w:rPr>
+          <w:rFonts w:cs="Times New Roman"/>
+          <w:sz w:val="28"/>
+          <w:szCs w:val="28"/>
+          <w:lang w:val="ru-RU"/>
+        </w:rPr>
+        <w:t>откройте вкладку</w:t>
+      </w:r>
+      <w:r>
+        <w:rPr>
+          <w:rFonts w:cs="Times New Roman"/>
+          <w:sz w:val="28"/>
+          <w:szCs w:val="28"/>
+          <w:lang w:val="ru-RU"/>
+        </w:rPr>
+        <w:t>:</w:t>
+      </w:r>
+      <w:r>
+        <w:rPr>
+          <w:rFonts w:cs="Times New Roman"/>
+          <w:b/>
+          <w:sz w:val="28"/>
+          <w:szCs w:val="28"/>
+          <w:lang w:val="ru-RU"/>
+        </w:rPr>
+        <w:t xml:space="preserve"> Дерево файлов</w:t>
+      </w:r>
+    </w:p>
+    <w:p>
+      <w:pPr>
+        <w:spacing w:after="0" w:line="360" w:lineRule="auto"/>
+        <w:ind w:firstLine="709"/>
+        <w:jc w:val="both"/>
+        <w:rPr>
+          <w:rFonts w:cs="Times New Roman"/>
+          <w:sz w:val="28"/>
+          <w:szCs w:val="28"/>
+          <w:lang w:val="ru-RU"/>
+        </w:rPr>
+      </w:pPr>
+      <w:r>
+        <w:rPr>
+          <w:rFonts w:cs="Times New Roman"/>
+          <w:sz w:val="28"/>
+          <w:szCs w:val="28"/>
+          <w:lang w:val="ru-RU"/>
+        </w:rPr>
+        <w:t>3.</w:t>
+      </w:r>
+      <w:r>
+        <w:rPr>
+          <w:rFonts w:cs="Times New Roman"/>
+          <w:sz w:val="28"/>
+          <w:szCs w:val="28"/>
+          <w:lang w:val="ru-RU"/>
+        </w:rPr>
+        <w:t>2</w:t>
+      </w:r>
+      <w:r>
+        <w:rPr>
+          <w:rFonts w:cs="Times New Roman"/>
+          <w:sz w:val="28"/>
+          <w:szCs w:val="28"/>
+          <w:lang w:val="ru-RU"/>
+        </w:rPr>
+        <w:t xml:space="preserve"> На </w:t>
+      </w:r>
+      <w:r>
+        <w:rPr>
+          <w:rFonts w:cs="Times New Roman"/>
+          <w:sz w:val="28"/>
+          <w:szCs w:val="28"/>
+          <w:lang w:val="ru-RU"/>
+        </w:rPr>
+        <w:t xml:space="preserve">открытой странице </w:t>
+      </w:r>
+      <w:r>
+        <w:rPr>
+          <w:rFonts w:cs="Times New Roman"/>
+          <w:sz w:val="28"/>
+          <w:szCs w:val="28"/>
+          <w:lang w:val="ru-RU"/>
+        </w:rPr>
+        <w:t xml:space="preserve">интерфейса в правой верхней части над деревом файлов нажмите кнопку </w:t>
       </w:r>
       <w:r>
         <w:rPr>
@@ -2211,7 +2789,25 @@
           <w:szCs w:val="28"/>
           <w:lang w:val="ru-RU"/>
         </w:rPr>
-        <w:t xml:space="preserve">3.4 На экране откроется модальное окно </w:t>
+        <w:t>3.</w:t>
+      </w:r>
+      <w:r>
+        <w:rPr>
+          <w:rFonts w:cs="Times New Roman"/>
+          <w:sz w:val="28"/>
+          <w:szCs w:val="28"/>
+          <w:lang w:val="ru-RU"/>
+        </w:rPr>
+        <w:t>3</w:t>
+      </w:r>
+      <w:r>
+        <w:rPr>
+          <w:rFonts w:cs="Times New Roman"/>
+          <w:sz w:val="28"/>
+          <w:szCs w:val="28"/>
+          <w:lang w:val="ru-RU"/>
+        </w:rPr>
+        <w:t xml:space="preserve"> На экране откроется модальное окно </w:t>
       </w:r>
       <w:r>
         <w:rPr>
@@ -2279,7 +2875,25 @@
           <w:szCs w:val="28"/>
           <w:lang w:val="ru-RU"/>
         </w:rPr>
-        <w:t xml:space="preserve">3.5 Синхронизация считается успешно завершенной, когда шкала прогресса заполнится до </w:t>
+        <w:t>3.</w:t>
+      </w:r>
+      <w:r>
+        <w:rPr>
+          <w:rFonts w:cs="Times New Roman"/>
+          <w:sz w:val="28"/>
+          <w:szCs w:val="28"/>
+          <w:lang w:val="ru-RU"/>
+        </w:rPr>
+        <w:t>4</w:t>
+      </w:r>
+      <w:r>
+        <w:rPr>
+          <w:rFonts w:cs="Times New Roman"/>
+          <w:sz w:val="28"/>
+          <w:szCs w:val="28"/>
+          <w:lang w:val="ru-RU"/>
+        </w:rPr>
+        <w:t xml:space="preserve"> Синхронизация считается успешно завершенной, когда шкала прогресса заполнится до </w:t>
       </w:r>
       <w:r>
         <w:rPr>
@@ -2453,6 +3067,7 @@
           <w:szCs w:val="28"/>
           <w:lang w:val="ru-RU"/>
         </w:rPr>
+        <w:lastRenderedPageBreak/>
         <w:t>После закрытия окна синхронизации обновленная база вопросов и ответов немедленно вступает в действие. Дополнительный перезапуск сервисов бота не требуется.</w:t>
       </w:r>
     </w:p>
@@ -2476,7 +3091,6 @@
           <w:szCs w:val="28"/>
           <w:lang w:val="ru-RU"/>
         </w:rPr>
-        <w:lastRenderedPageBreak/>
         <w:t>4 Контроль выполнения и действия при сбоях</w:t>
       </w:r>
     </w:p>
@@ -3823,7 +4437,7 @@
   <w:style w:type="paragraph" w:default="1" w:styleId="Normal">
     <w:name w:val="Normal"/>
     <w:qFormat/>
-    <w:rsid w:val="00FC693F"/>
+    <w:rsid w:val="001936BB"/>
     <w:pPr>
       <w:spacing w:after="80"/>
     </w:pPr>
@@ -14820,6 +15434,29 @@
         <w:shd w:val="clear" w:color="auto" w:fill="FBCAA2" w:themeFill="accent6" w:themeFillTint="7F"/>
       </w:tcPr>
     </w:tblStylePr>
+  </w:style>
+  <w:style w:type="character" w:styleId="Hyperlink">
+    <w:name w:val="Hyperlink"/>
+    <w:basedOn w:val="DefaultParagraphFont"/>
+    <w:uiPriority w:val="99"/>
+    <w:unhideWhenUsed/>
+    <w:rsid w:val="001936BB"/>
+    <w:rPr>
+      <w:color w:val="0000FF" w:themeColor="hyperlink"/>
+      <w:u w:val="single"/>
+    </w:rPr>
+  </w:style>
+  <w:style w:type="character" w:styleId="UnresolvedMention">
+    <w:name w:val="Unresolved Mention"/>
+    <w:basedOn w:val="DefaultParagraphFont"/>
+    <w:uiPriority w:val="99"/>
+    <w:semiHidden/>
+    <w:unhideWhenUsed/>
+    <w:rsid w:val="001936BB"/>
+    <w:rPr>
+      <w:color w:val="605E5C"/>
+      <w:shd w:val="clear" w:color="auto" w:fill="E1DFDD"/>
+    </w:rPr>
   </w:style>
 </w:styles>
 </file>

</xml_diff>